<commit_message>
updated day 4 folders
</commit_message>
<xml_diff>
--- a/Day4/Product_prd.docx
+++ b/Day4/Product_prd.docx
@@ -236,16 +236,45 @@
         <w:t>Use AI to simplify the creation of society notices and reduce manual writing effort.</w:t>
       </w:r>
     </w:p>
-    <w:p/>
-    <w:p>
-      <w:pPr>
+    <w:p>
+      <w:pPr>
+        <w:numPr>
+          <w:ilvl w:val="0"/>
+          <w:numId w:val="52"/>
+        </w:numPr>
+      </w:pPr>
+      <w:r>
         <w:rPr>
           <w:b/>
           <w:bCs/>
           <w:sz w:val="24"/>
           <w:szCs w:val="24"/>
         </w:rPr>
-      </w:pPr>
+        <w:lastRenderedPageBreak/>
+        <w:t>Target Users</w:t>
+      </w:r>
+    </w:p>
+    <w:p>
+      <w:r>
+        <w:rPr>
+          <w:b/>
+          <w:bCs/>
+        </w:rPr>
+        <w:tab/>
+      </w:r>
+      <w:r>
+        <w:t>1) Society Treasurer</w:t>
+      </w:r>
+    </w:p>
+    <w:p>
+      <w:r>
+        <w:t xml:space="preserve">              2) Society Secretary</w:t>
+      </w:r>
+    </w:p>
+    <w:p>
+      <w:r>
+        <w:t xml:space="preserve">              3) Society Chairman</w:t>
+      </w:r>
     </w:p>
     <w:p>
       <w:pPr>
@@ -256,26 +285,24 @@
           <w:szCs w:val="24"/>
         </w:rPr>
       </w:pPr>
-    </w:p>
-    <w:p>
-      <w:pPr>
+      <w:r>
         <w:rPr>
           <w:b/>
           <w:bCs/>
           <w:sz w:val="24"/>
           <w:szCs w:val="24"/>
         </w:rPr>
-      </w:pPr>
-    </w:p>
-    <w:p>
-      <w:pPr>
+        <w:t>U</w:t>
+      </w:r>
+      <w:r>
         <w:rPr>
           <w:b/>
           <w:bCs/>
           <w:sz w:val="24"/>
           <w:szCs w:val="24"/>
         </w:rPr>
-      </w:pPr>
+        <w:t xml:space="preserve">ser </w:t>
+      </w:r>
       <w:r>
         <w:rPr>
           <w:b/>
@@ -283,488 +310,473 @@
           <w:sz w:val="24"/>
           <w:szCs w:val="24"/>
         </w:rPr>
-        <w:t>Target Users</w:t>
-      </w:r>
-    </w:p>
-    <w:p>
-      <w:r>
-        <w:rPr>
-          <w:b/>
-          <w:bCs/>
-        </w:rPr>
-        <w:tab/>
-      </w:r>
-      <w:r>
-        <w:t>1) Society Treasurer</w:t>
-      </w:r>
-    </w:p>
-    <w:p>
-      <w:r>
-        <w:t xml:space="preserve">              2) Society Secretary</w:t>
-      </w:r>
-    </w:p>
-    <w:p>
-      <w:r>
-        <w:t xml:space="preserve">              3) Society Chairman</w:t>
-      </w:r>
-    </w:p>
-    <w:p>
-      <w:pPr>
+        <w:t>P</w:t>
+      </w:r>
+      <w:r>
         <w:rPr>
           <w:b/>
           <w:bCs/>
           <w:sz w:val="24"/>
           <w:szCs w:val="24"/>
         </w:rPr>
-      </w:pPr>
-      <w:r>
+        <w:t>ersonas</w:t>
+      </w:r>
+    </w:p>
+    <w:p>
+      <w:r>
+        <w:t>Persona 1: Society Treasurer</w:t>
+      </w:r>
+    </w:p>
+    <w:p>
+      <w:r>
+        <w:t>Name: Mr Prakash Shinde</w:t>
+      </w:r>
+      <w:r>
+        <w:br/>
+        <w:t>Role: Society Treasurer</w:t>
+      </w:r>
+    </w:p>
+    <w:p>
+      <w:r>
+        <w:t>Goals</w:t>
+      </w:r>
+    </w:p>
+    <w:p>
+      <w:pPr>
+        <w:numPr>
+          <w:ilvl w:val="0"/>
+          <w:numId w:val="1"/>
+        </w:numPr>
+      </w:pPr>
+      <w:r>
+        <w:t xml:space="preserve">Maintain accurate resident records. </w:t>
+      </w:r>
+    </w:p>
+    <w:p>
+      <w:pPr>
+        <w:numPr>
+          <w:ilvl w:val="0"/>
+          <w:numId w:val="1"/>
+        </w:numPr>
+      </w:pPr>
+      <w:r>
+        <w:t xml:space="preserve">Record and track maintenance payments. </w:t>
+      </w:r>
+    </w:p>
+    <w:p>
+      <w:pPr>
+        <w:numPr>
+          <w:ilvl w:val="0"/>
+          <w:numId w:val="1"/>
+        </w:numPr>
+      </w:pPr>
+      <w:r>
+        <w:t xml:space="preserve">Generate financial statements and reports. </w:t>
+      </w:r>
+    </w:p>
+    <w:p>
+      <w:pPr>
+        <w:numPr>
+          <w:ilvl w:val="0"/>
+          <w:numId w:val="1"/>
+        </w:numPr>
+      </w:pPr>
+      <w:r>
+        <w:t xml:space="preserve">Monitor pending maintenance dues. </w:t>
+      </w:r>
+    </w:p>
+    <w:p>
+      <w:r>
+        <w:t>Frustrations</w:t>
+      </w:r>
+    </w:p>
+    <w:p>
+      <w:pPr>
+        <w:numPr>
+          <w:ilvl w:val="0"/>
+          <w:numId w:val="2"/>
+        </w:numPr>
+      </w:pPr>
+      <w:r>
+        <w:t xml:space="preserve">Resident and payment records are spread across Excel files and paper registers. </w:t>
+      </w:r>
+    </w:p>
+    <w:p>
+      <w:pPr>
+        <w:numPr>
+          <w:ilvl w:val="0"/>
+          <w:numId w:val="2"/>
+        </w:numPr>
+      </w:pPr>
+      <w:r>
+        <w:t xml:space="preserve">Preparing monthly financial reports is time-consuming. </w:t>
+      </w:r>
+    </w:p>
+    <w:p>
+      <w:pPr>
+        <w:numPr>
+          <w:ilvl w:val="0"/>
+          <w:numId w:val="2"/>
+        </w:numPr>
+      </w:pPr>
+      <w:r>
+        <w:t xml:space="preserve">Finding payment history takes longer than it should. </w:t>
+      </w:r>
+    </w:p>
+    <w:p>
+      <w:pPr>
+        <w:numPr>
+          <w:ilvl w:val="0"/>
+          <w:numId w:val="2"/>
+        </w:numPr>
+      </w:pPr>
+      <w:r>
+        <w:t xml:space="preserve">Manual calculations can lead to errors. </w:t>
+      </w:r>
+    </w:p>
+    <w:p>
+      <w:r>
+        <w:t>Context</w:t>
+      </w:r>
+    </w:p>
+    <w:p>
+      <w:r>
+        <w:t>My father manages the finances of a housing society with around 56 flats. He spends several hours each week updating Excel sheets, maintaining registers, and preparing financial reports.</w:t>
+      </w:r>
+    </w:p>
+    <w:p/>
+    <w:p>
+      <w:r>
+        <w:t>Persona 2: Society Secretary</w:t>
+      </w:r>
+    </w:p>
+    <w:p>
+      <w:pPr>
+        <w:rPr>
+          <w:b/>
+          <w:bCs/>
+        </w:rPr>
+      </w:pPr>
+      <w:r>
+        <w:t>Name</w:t>
+      </w:r>
+      <w:r>
+        <w:rPr>
+          <w:b/>
+          <w:bCs/>
+        </w:rPr>
+        <w:t>:</w:t>
+      </w:r>
+      <w:r>
+        <w:t xml:space="preserve"> Mr Bablu Blkhande</w:t>
+      </w:r>
+      <w:r>
+        <w:br/>
+      </w:r>
+      <w:r>
+        <w:t>Role: Society Secretary</w:t>
+      </w:r>
+    </w:p>
+    <w:p>
+      <w:r>
+        <w:t>Goals</w:t>
+      </w:r>
+    </w:p>
+    <w:p>
+      <w:pPr>
+        <w:numPr>
+          <w:ilvl w:val="0"/>
+          <w:numId w:val="3"/>
+        </w:numPr>
+      </w:pPr>
+      <w:r>
+        <w:t xml:space="preserve">Maintain resident information. </w:t>
+      </w:r>
+    </w:p>
+    <w:p>
+      <w:pPr>
+        <w:numPr>
+          <w:ilvl w:val="0"/>
+          <w:numId w:val="3"/>
+        </w:numPr>
+      </w:pPr>
+      <w:r>
+        <w:t xml:space="preserve">Publish society notices. </w:t>
+      </w:r>
+    </w:p>
+    <w:p>
+      <w:pPr>
+        <w:numPr>
+          <w:ilvl w:val="0"/>
+          <w:numId w:val="3"/>
+        </w:numPr>
+      </w:pPr>
+      <w:r>
+        <w:t xml:space="preserve">Keep records organized. </w:t>
+      </w:r>
+    </w:p>
+    <w:p>
+      <w:pPr>
+        <w:numPr>
+          <w:ilvl w:val="0"/>
+          <w:numId w:val="3"/>
+        </w:numPr>
+      </w:pPr>
+      <w:r>
+        <w:t xml:space="preserve">Coordinate daily administrative tasks. </w:t>
+      </w:r>
+    </w:p>
+    <w:p>
+      <w:r>
+        <w:t>Frustrations</w:t>
+      </w:r>
+    </w:p>
+    <w:p>
+      <w:pPr>
+        <w:numPr>
+          <w:ilvl w:val="0"/>
+          <w:numId w:val="4"/>
+        </w:numPr>
+      </w:pPr>
+      <w:r>
+        <w:t xml:space="preserve">Notices are shared through WhatsApp and are difficult to track later. </w:t>
+      </w:r>
+    </w:p>
+    <w:p>
+      <w:pPr>
+        <w:numPr>
+          <w:ilvl w:val="0"/>
+          <w:numId w:val="4"/>
+        </w:numPr>
+      </w:pPr>
+      <w:r>
+        <w:lastRenderedPageBreak/>
+        <w:t xml:space="preserve">Resident information is stored in multiple files. </w:t>
+      </w:r>
+    </w:p>
+    <w:p>
+      <w:pPr>
+        <w:numPr>
+          <w:ilvl w:val="0"/>
+          <w:numId w:val="4"/>
+        </w:numPr>
+      </w:pPr>
+      <w:r>
+        <w:t xml:space="preserve">Finding old notices or resident details takes time. </w:t>
+      </w:r>
+    </w:p>
+    <w:p>
+      <w:pPr>
+        <w:numPr>
+          <w:ilvl w:val="0"/>
+          <w:numId w:val="4"/>
+        </w:numPr>
+      </w:pPr>
+      <w:r>
+        <w:t xml:space="preserve">Managing records across different tools is confusing. </w:t>
+      </w:r>
+    </w:p>
+    <w:p>
+      <w:r>
+        <w:t>Context</w:t>
+      </w:r>
+    </w:p>
+    <w:p>
+      <w:r>
+        <w:t>Mr Dhangmale sir handles the day-to-day administration of the society. He updates resident information, shares announcements, and coordinates with the committee.</w:t>
+      </w:r>
+    </w:p>
+    <w:p/>
+    <w:p>
+      <w:r>
+        <w:t>Persona 3: Society Chairman</w:t>
+      </w:r>
+    </w:p>
+    <w:p>
+      <w:r>
+        <w:t>Name:</w:t>
+      </w:r>
+      <w:r>
+        <w:t xml:space="preserve"> Mr Bablu Blkhande</w:t>
+      </w:r>
+      <w:r>
+        <w:br/>
+      </w:r>
+      <w:r>
+        <w:t>Role:</w:t>
+      </w:r>
+      <w:r>
+        <w:t xml:space="preserve"> Society Chairman</w:t>
+      </w:r>
+    </w:p>
+    <w:p>
+      <w:r>
+        <w:t>Goals</w:t>
+      </w:r>
+    </w:p>
+    <w:p>
+      <w:pPr>
+        <w:numPr>
+          <w:ilvl w:val="0"/>
+          <w:numId w:val="5"/>
+        </w:numPr>
+      </w:pPr>
+      <w:r>
+        <w:t xml:space="preserve">Monitor society operations through a dashboard. </w:t>
+      </w:r>
+    </w:p>
+    <w:p>
+      <w:pPr>
+        <w:numPr>
+          <w:ilvl w:val="0"/>
+          <w:numId w:val="5"/>
+        </w:numPr>
+      </w:pPr>
+      <w:r>
+        <w:t xml:space="preserve">Review maintenance collections and financial summaries. </w:t>
+      </w:r>
+    </w:p>
+    <w:p>
+      <w:pPr>
+        <w:numPr>
+          <w:ilvl w:val="0"/>
+          <w:numId w:val="5"/>
+        </w:numPr>
+      </w:pPr>
+      <w:r>
+        <w:t xml:space="preserve">Access important reports quickly. </w:t>
+      </w:r>
+    </w:p>
+    <w:p>
+      <w:pPr>
+        <w:numPr>
+          <w:ilvl w:val="0"/>
+          <w:numId w:val="5"/>
+        </w:numPr>
+      </w:pPr>
+      <w:r>
+        <w:t xml:space="preserve">Make informed decisions during committee meetings. </w:t>
+      </w:r>
+    </w:p>
+    <w:p>
+      <w:r>
+        <w:t>Frustrations</w:t>
+      </w:r>
+    </w:p>
+    <w:p>
+      <w:pPr>
+        <w:numPr>
+          <w:ilvl w:val="0"/>
+          <w:numId w:val="6"/>
+        </w:numPr>
+      </w:pPr>
+      <w:r>
+        <w:t xml:space="preserve">Has to ask different committee members for updates. </w:t>
+      </w:r>
+    </w:p>
+    <w:p>
+      <w:pPr>
+        <w:numPr>
+          <w:ilvl w:val="0"/>
+          <w:numId w:val="6"/>
+        </w:numPr>
+      </w:pPr>
+      <w:r>
+        <w:t xml:space="preserve">Financial information is not available in one place. </w:t>
+      </w:r>
+    </w:p>
+    <w:p>
+      <w:pPr>
+        <w:numPr>
+          <w:ilvl w:val="0"/>
+          <w:numId w:val="6"/>
+        </w:numPr>
+      </w:pPr>
+      <w:r>
+        <w:t xml:space="preserve">Difficult to get an overall view of society operations. </w:t>
+      </w:r>
+    </w:p>
+    <w:p>
+      <w:pPr>
+        <w:numPr>
+          <w:ilvl w:val="0"/>
+          <w:numId w:val="6"/>
+        </w:numPr>
+      </w:pPr>
+      <w:r>
+        <w:t xml:space="preserve">Manual reports are not always up to date. </w:t>
+      </w:r>
+    </w:p>
+    <w:p>
+      <w:r>
+        <w:t>Context</w:t>
+      </w:r>
+    </w:p>
+    <w:p>
+      <w:pPr>
+        <w:rPr>
+          <w:b/>
+          <w:bCs/>
+        </w:rPr>
+      </w:pPr>
+      <w:r>
+        <w:t>Mr Bablu Blkhande oversees the overall functioning of the housing society. He wants quick access to accurate information about finances, residents, and administrative activities without relying on multiple spreadsheets or registers.</w:t>
+      </w:r>
+    </w:p>
+    <w:p/>
+    <w:p>
+      <w:pPr>
         <w:rPr>
           <w:b/>
           <w:bCs/>
           <w:sz w:val="24"/>
           <w:szCs w:val="24"/>
         </w:rPr>
-        <w:t>U</w:t>
-      </w:r>
-      <w:r>
+      </w:pPr>
+    </w:p>
+    <w:p>
+      <w:pPr>
         <w:rPr>
           <w:b/>
           <w:bCs/>
           <w:sz w:val="24"/>
           <w:szCs w:val="24"/>
         </w:rPr>
-        <w:t xml:space="preserve">ser </w:t>
-      </w:r>
-      <w:r>
+      </w:pPr>
+    </w:p>
+    <w:p>
+      <w:pPr>
         <w:rPr>
           <w:b/>
           <w:bCs/>
           <w:sz w:val="24"/>
           <w:szCs w:val="24"/>
         </w:rPr>
-        <w:t>P</w:t>
-      </w:r>
-      <w:r>
+      </w:pPr>
+    </w:p>
+    <w:p>
+      <w:pPr>
         <w:rPr>
           <w:b/>
           <w:bCs/>
           <w:sz w:val="24"/>
           <w:szCs w:val="24"/>
         </w:rPr>
-        <w:t>ersonas</w:t>
-      </w:r>
-    </w:p>
-    <w:p>
-      <w:r>
-        <w:t>Persona 1: Society Treasurer</w:t>
-      </w:r>
-    </w:p>
-    <w:p>
-      <w:r>
-        <w:t>Name: Mr Prakash Shinde</w:t>
-      </w:r>
-      <w:r>
-        <w:br/>
-        <w:t>Role: Society Treasurer</w:t>
-      </w:r>
-    </w:p>
-    <w:p>
-      <w:r>
-        <w:t>Goals</w:t>
-      </w:r>
-    </w:p>
-    <w:p>
-      <w:pPr>
-        <w:numPr>
-          <w:ilvl w:val="0"/>
-          <w:numId w:val="1"/>
-        </w:numPr>
-      </w:pPr>
-      <w:r>
-        <w:t xml:space="preserve">Maintain accurate resident records. </w:t>
-      </w:r>
-    </w:p>
-    <w:p>
-      <w:pPr>
-        <w:numPr>
-          <w:ilvl w:val="0"/>
-          <w:numId w:val="1"/>
-        </w:numPr>
-      </w:pPr>
-      <w:r>
-        <w:t xml:space="preserve">Record and track maintenance payments. </w:t>
-      </w:r>
-    </w:p>
-    <w:p>
-      <w:pPr>
-        <w:numPr>
-          <w:ilvl w:val="0"/>
-          <w:numId w:val="1"/>
-        </w:numPr>
-      </w:pPr>
-      <w:r>
-        <w:t xml:space="preserve">Generate financial statements and reports. </w:t>
-      </w:r>
-    </w:p>
-    <w:p>
-      <w:pPr>
-        <w:numPr>
-          <w:ilvl w:val="0"/>
-          <w:numId w:val="1"/>
-        </w:numPr>
-      </w:pPr>
-      <w:r>
-        <w:t xml:space="preserve">Monitor pending maintenance dues. </w:t>
-      </w:r>
-    </w:p>
-    <w:p>
-      <w:r>
-        <w:t>Frustrations</w:t>
-      </w:r>
-    </w:p>
-    <w:p>
-      <w:pPr>
-        <w:numPr>
-          <w:ilvl w:val="0"/>
-          <w:numId w:val="2"/>
-        </w:numPr>
-      </w:pPr>
-      <w:r>
-        <w:t xml:space="preserve">Resident and payment records are spread across Excel files and paper registers. </w:t>
-      </w:r>
-    </w:p>
-    <w:p>
-      <w:pPr>
-        <w:numPr>
-          <w:ilvl w:val="0"/>
-          <w:numId w:val="2"/>
-        </w:numPr>
-      </w:pPr>
-      <w:r>
-        <w:t xml:space="preserve">Preparing monthly financial reports is time-consuming. </w:t>
-      </w:r>
-    </w:p>
-    <w:p>
-      <w:pPr>
-        <w:numPr>
-          <w:ilvl w:val="0"/>
-          <w:numId w:val="2"/>
-        </w:numPr>
-      </w:pPr>
-      <w:r>
-        <w:t xml:space="preserve">Finding payment history takes longer than it should. </w:t>
-      </w:r>
-    </w:p>
-    <w:p>
-      <w:pPr>
-        <w:numPr>
-          <w:ilvl w:val="0"/>
-          <w:numId w:val="2"/>
-        </w:numPr>
-      </w:pPr>
-      <w:r>
-        <w:t xml:space="preserve">Manual calculations can lead to errors. </w:t>
-      </w:r>
-    </w:p>
-    <w:p>
-      <w:r>
-        <w:t>Context</w:t>
-      </w:r>
-    </w:p>
-    <w:p>
-      <w:r>
-        <w:t>My father manages the finances of a housing society with around 56 flats. He spends several hours each week updating Excel sheets, maintaining registers, and preparing financial reports.</w:t>
-      </w:r>
-    </w:p>
-    <w:p/>
-    <w:p>
-      <w:r>
-        <w:t>Persona 2: Society Secretary</w:t>
-      </w:r>
-    </w:p>
-    <w:p>
-      <w:pPr>
-        <w:rPr>
-          <w:b/>
-          <w:bCs/>
-        </w:rPr>
-      </w:pPr>
-      <w:r>
-        <w:t>Name</w:t>
-      </w:r>
-      <w:r>
-        <w:rPr>
-          <w:b/>
-          <w:bCs/>
-        </w:rPr>
-        <w:t>:</w:t>
-      </w:r>
-      <w:r>
-        <w:t xml:space="preserve"> Mr Bablu Blkhande</w:t>
-      </w:r>
-      <w:r>
-        <w:br/>
-      </w:r>
-      <w:r>
-        <w:t>Role: Society Secretary</w:t>
-      </w:r>
-    </w:p>
-    <w:p>
-      <w:r>
-        <w:t>Goals</w:t>
-      </w:r>
-    </w:p>
-    <w:p>
-      <w:pPr>
-        <w:numPr>
-          <w:ilvl w:val="0"/>
-          <w:numId w:val="3"/>
-        </w:numPr>
-      </w:pPr>
-      <w:r>
-        <w:t xml:space="preserve">Maintain resident information. </w:t>
-      </w:r>
-    </w:p>
-    <w:p>
-      <w:pPr>
-        <w:numPr>
-          <w:ilvl w:val="0"/>
-          <w:numId w:val="3"/>
-        </w:numPr>
-      </w:pPr>
-      <w:r>
-        <w:t xml:space="preserve">Publish society notices. </w:t>
-      </w:r>
-    </w:p>
-    <w:p>
-      <w:pPr>
-        <w:numPr>
-          <w:ilvl w:val="0"/>
-          <w:numId w:val="3"/>
-        </w:numPr>
-      </w:pPr>
-      <w:r>
-        <w:lastRenderedPageBreak/>
-        <w:t xml:space="preserve">Keep records organized. </w:t>
-      </w:r>
-    </w:p>
-    <w:p>
-      <w:pPr>
-        <w:numPr>
-          <w:ilvl w:val="0"/>
-          <w:numId w:val="3"/>
-        </w:numPr>
-      </w:pPr>
-      <w:r>
-        <w:t xml:space="preserve">Coordinate daily administrative tasks. </w:t>
-      </w:r>
-    </w:p>
-    <w:p>
-      <w:r>
-        <w:t>Frustrations</w:t>
-      </w:r>
-    </w:p>
-    <w:p>
-      <w:pPr>
-        <w:numPr>
-          <w:ilvl w:val="0"/>
-          <w:numId w:val="4"/>
-        </w:numPr>
-      </w:pPr>
-      <w:r>
-        <w:t xml:space="preserve">Notices are shared through WhatsApp and are difficult to track later. </w:t>
-      </w:r>
-    </w:p>
-    <w:p>
-      <w:pPr>
-        <w:numPr>
-          <w:ilvl w:val="0"/>
-          <w:numId w:val="4"/>
-        </w:numPr>
-      </w:pPr>
-      <w:r>
-        <w:t xml:space="preserve">Resident information is stored in multiple files. </w:t>
-      </w:r>
-    </w:p>
-    <w:p>
-      <w:pPr>
-        <w:numPr>
-          <w:ilvl w:val="0"/>
-          <w:numId w:val="4"/>
-        </w:numPr>
-      </w:pPr>
-      <w:r>
-        <w:t xml:space="preserve">Finding old notices or resident details takes time. </w:t>
-      </w:r>
-    </w:p>
-    <w:p>
-      <w:pPr>
-        <w:numPr>
-          <w:ilvl w:val="0"/>
-          <w:numId w:val="4"/>
-        </w:numPr>
-      </w:pPr>
-      <w:r>
-        <w:t xml:space="preserve">Managing records across different tools is confusing. </w:t>
-      </w:r>
-    </w:p>
-    <w:p>
-      <w:r>
-        <w:t>Context</w:t>
-      </w:r>
-    </w:p>
-    <w:p>
-      <w:r>
-        <w:t>Mr Dhangmale sir handles the day-to-day administration of the society. He updates resident information, shares announcements, and coordinates with the committee.</w:t>
-      </w:r>
-    </w:p>
-    <w:p/>
-    <w:p>
-      <w:r>
-        <w:t>Persona 3: Society Chairman</w:t>
-      </w:r>
-    </w:p>
-    <w:p>
-      <w:r>
-        <w:t>Name:</w:t>
-      </w:r>
-      <w:r>
-        <w:t xml:space="preserve"> Mr Bablu Blkhande</w:t>
-      </w:r>
-      <w:r>
-        <w:br/>
-      </w:r>
-      <w:r>
-        <w:t>Role:</w:t>
-      </w:r>
-      <w:r>
-        <w:t xml:space="preserve"> Society Chairman</w:t>
-      </w:r>
-    </w:p>
-    <w:p>
-      <w:r>
-        <w:t>Goals</w:t>
-      </w:r>
-    </w:p>
-    <w:p>
-      <w:pPr>
-        <w:numPr>
-          <w:ilvl w:val="0"/>
-          <w:numId w:val="5"/>
-        </w:numPr>
-      </w:pPr>
-      <w:r>
-        <w:t xml:space="preserve">Monitor society operations through a dashboard. </w:t>
-      </w:r>
-    </w:p>
-    <w:p>
-      <w:pPr>
-        <w:numPr>
-          <w:ilvl w:val="0"/>
-          <w:numId w:val="5"/>
-        </w:numPr>
-      </w:pPr>
-      <w:r>
-        <w:t xml:space="preserve">Review maintenance collections and financial summaries. </w:t>
-      </w:r>
-    </w:p>
-    <w:p>
-      <w:pPr>
-        <w:numPr>
-          <w:ilvl w:val="0"/>
-          <w:numId w:val="5"/>
-        </w:numPr>
-      </w:pPr>
-      <w:r>
-        <w:t xml:space="preserve">Access important reports quickly. </w:t>
-      </w:r>
-    </w:p>
-    <w:p>
-      <w:pPr>
-        <w:numPr>
-          <w:ilvl w:val="0"/>
-          <w:numId w:val="5"/>
-        </w:numPr>
-      </w:pPr>
-      <w:r>
-        <w:t xml:space="preserve">Make informed decisions during committee meetings. </w:t>
-      </w:r>
-    </w:p>
-    <w:p>
-      <w:r>
-        <w:t>Frustrations</w:t>
-      </w:r>
-    </w:p>
-    <w:p>
-      <w:pPr>
-        <w:numPr>
-          <w:ilvl w:val="0"/>
-          <w:numId w:val="6"/>
-        </w:numPr>
-      </w:pPr>
-      <w:r>
-        <w:t xml:space="preserve">Has to ask different committee members for updates. </w:t>
-      </w:r>
-    </w:p>
-    <w:p>
-      <w:pPr>
-        <w:numPr>
-          <w:ilvl w:val="0"/>
-          <w:numId w:val="6"/>
-        </w:numPr>
-      </w:pPr>
-      <w:r>
-        <w:t xml:space="preserve">Financial information is not available in one place. </w:t>
-      </w:r>
-    </w:p>
-    <w:p>
-      <w:pPr>
-        <w:numPr>
-          <w:ilvl w:val="0"/>
-          <w:numId w:val="6"/>
-        </w:numPr>
-      </w:pPr>
-      <w:r>
-        <w:t xml:space="preserve">Difficult to get an overall view of society operations. </w:t>
-      </w:r>
-    </w:p>
-    <w:p>
-      <w:pPr>
-        <w:numPr>
-          <w:ilvl w:val="0"/>
-          <w:numId w:val="6"/>
-        </w:numPr>
-      </w:pPr>
-      <w:r>
-        <w:t xml:space="preserve">Manual reports are not always up to date. </w:t>
-      </w:r>
-    </w:p>
-    <w:p>
-      <w:r>
-        <w:t>Context</w:t>
-      </w:r>
-    </w:p>
-    <w:p>
-      <w:pPr>
-        <w:rPr>
-          <w:b/>
-          <w:bCs/>
-        </w:rPr>
-      </w:pPr>
-      <w:r>
-        <w:t>Mr Bablu Blkhande oversees the overall functioning of the housing society. He wants quick access to accurate information about finances, residents, and administrative activities without relying on multiple spreadsheets or registers.</w:t>
-      </w:r>
-    </w:p>
-    <w:p/>
-    <w:p>
-      <w:pPr>
+      </w:pPr>
+      <w:r>
         <w:rPr>
           <w:b/>
           <w:bCs/>
           <w:sz w:val="24"/>
           <w:szCs w:val="24"/>
         </w:rPr>
-      </w:pPr>
+        <w:t xml:space="preserve">Value proposition: </w:t>
+      </w:r>
+    </w:p>
+    <w:p>
+      <w:r>
+        <w:t>For housing society committee members who need an efficient way to manage resident records, maintenance payments, financial statements, and society notices, our product provides a centralized management system that organizes all society information in one place, unlike Excel sheets, WhatsApp chats, and manual registers.</w:t>
+      </w:r>
     </w:p>
     <w:p>
       <w:pPr>
@@ -795,42 +807,173 @@
           <w:szCs w:val="24"/>
         </w:rPr>
       </w:pPr>
-      <w:r>
+    </w:p>
+    <w:p>
+      <w:pPr>
         <w:rPr>
           <w:b/>
           <w:bCs/>
           <w:sz w:val="24"/>
           <w:szCs w:val="24"/>
         </w:rPr>
-        <w:lastRenderedPageBreak/>
-        <w:t xml:space="preserve">Value proposition: </w:t>
-      </w:r>
-    </w:p>
-    <w:p>
-      <w:r>
-        <w:t>For housing society committee members who need an efficient way to manage resident records, maintenance payments, financial statements, and society notices, our product provides a centralized management system that organizes all society information in one place, unlike Excel sheets, WhatsApp chats, and manual registers.</w:t>
-      </w:r>
-    </w:p>
-    <w:p>
-      <w:pPr>
+      </w:pPr>
+      <w:r>
         <w:rPr>
           <w:b/>
           <w:bCs/>
           <w:sz w:val="24"/>
           <w:szCs w:val="24"/>
         </w:rPr>
-      </w:pPr>
-    </w:p>
-    <w:p>
-      <w:pPr>
+        <w:t>Competitor</w:t>
+      </w:r>
+      <w:r>
         <w:rPr>
           <w:b/>
           <w:bCs/>
           <w:sz w:val="24"/>
           <w:szCs w:val="24"/>
         </w:rPr>
-      </w:pPr>
-    </w:p>
+        <w:t xml:space="preserve"> Analysis</w:t>
+      </w:r>
+    </w:p>
+    <w:p>
+      <w:pPr>
+        <w:rPr>
+          <w:b/>
+          <w:bCs/>
+        </w:rPr>
+      </w:pPr>
+      <w:r>
+        <w:rPr>
+          <w:b/>
+          <w:bCs/>
+        </w:rPr>
+        <w:t>1) My Gate</w:t>
+      </w:r>
+    </w:p>
+    <w:p>
+      <w:r>
+        <w:t>What it offers:</w:t>
+      </w:r>
+    </w:p>
+    <w:p>
+      <w:r>
+        <w:t>Visitor management, resident communication, maintenance billing, notices, and community management.</w:t>
+      </w:r>
+    </w:p>
+    <w:p>
+      <w:r>
+        <w:t>Strength:</w:t>
+      </w:r>
+    </w:p>
+    <w:p>
+      <w:r>
+        <w:t>Popular, feature-rich, widely used in apartment societies.</w:t>
+      </w:r>
+    </w:p>
+    <w:p>
+      <w:r>
+        <w:t>Limitations:</w:t>
+      </w:r>
+    </w:p>
+    <w:p>
+      <w:r>
+        <w:t>Can be more complex and expensive for smaller societies.</w:t>
+      </w:r>
+    </w:p>
+    <w:p/>
+    <w:p>
+      <w:pPr>
+        <w:rPr>
+          <w:b/>
+          <w:bCs/>
+        </w:rPr>
+      </w:pPr>
+      <w:r>
+        <w:rPr>
+          <w:b/>
+          <w:bCs/>
+        </w:rPr>
+        <w:t>2) NoBrokerHood</w:t>
+      </w:r>
+    </w:p>
+    <w:p>
+      <w:r>
+        <w:t>What it offers:</w:t>
+      </w:r>
+    </w:p>
+    <w:p>
+      <w:r>
+        <w:t>Visitor management, maintenance billing, accounting, notices, and resident communication.</w:t>
+      </w:r>
+    </w:p>
+    <w:p>
+      <w:r>
+        <w:t>Strength:</w:t>
+      </w:r>
+    </w:p>
+    <w:p>
+      <w:r>
+        <w:t>Comprehensive solution with mobile app support.</w:t>
+      </w:r>
+    </w:p>
+    <w:p>
+      <w:r>
+        <w:t>Limitations:</w:t>
+      </w:r>
+    </w:p>
+    <w:p>
+      <w:r>
+        <w:t>Includes many advanced features that small societies may not need.</w:t>
+      </w:r>
+    </w:p>
+    <w:p/>
+    <w:p>
+      <w:pPr>
+        <w:rPr>
+          <w:b/>
+          <w:bCs/>
+        </w:rPr>
+      </w:pPr>
+      <w:r>
+        <w:rPr>
+          <w:b/>
+          <w:bCs/>
+        </w:rPr>
+        <w:t>3) ApartmentADDA</w:t>
+      </w:r>
+    </w:p>
+    <w:p>
+      <w:r>
+        <w:t>What it offers:</w:t>
+      </w:r>
+    </w:p>
+    <w:p>
+      <w:r>
+        <w:t>Resident management, accounting, maintenance billing, notices, helpdesk, and reports.</w:t>
+      </w:r>
+    </w:p>
+    <w:p>
+      <w:r>
+        <w:t>Strength:</w:t>
+      </w:r>
+    </w:p>
+    <w:p>
+      <w:r>
+        <w:t>Strong accounting and administrative features.</w:t>
+      </w:r>
+    </w:p>
+    <w:p>
+      <w:r>
+        <w:t>Limitations:</w:t>
+      </w:r>
+    </w:p>
+    <w:p>
+      <w:r>
+        <w:t>May require training because of its large feature set.</w:t>
+      </w:r>
+    </w:p>
+    <w:p/>
     <w:p>
       <w:pPr>
         <w:rPr>
@@ -850,164 +993,27 @@
           <w:szCs w:val="24"/>
         </w:rPr>
       </w:pPr>
-      <w:r>
+    </w:p>
+    <w:p>
+      <w:pPr>
         <w:rPr>
           <w:b/>
           <w:bCs/>
           <w:sz w:val="24"/>
           <w:szCs w:val="24"/>
         </w:rPr>
-        <w:t>Competitor</w:t>
-      </w:r>
-      <w:r>
+      </w:pPr>
+    </w:p>
+    <w:p>
+      <w:pPr>
         <w:rPr>
           <w:b/>
           <w:bCs/>
           <w:sz w:val="24"/>
           <w:szCs w:val="24"/>
         </w:rPr>
-        <w:t xml:space="preserve"> Analysis</w:t>
-      </w:r>
-    </w:p>
-    <w:p>
-      <w:pPr>
-        <w:rPr>
-          <w:b/>
-          <w:bCs/>
-        </w:rPr>
-      </w:pPr>
-      <w:r>
-        <w:rPr>
-          <w:b/>
-          <w:bCs/>
-        </w:rPr>
-        <w:t>1) My Gate</w:t>
-      </w:r>
-    </w:p>
-    <w:p>
-      <w:r>
-        <w:t>What it offers:</w:t>
-      </w:r>
-    </w:p>
-    <w:p>
-      <w:r>
-        <w:t>Visitor management, resident communication, maintenance billing, notices, and community management.</w:t>
-      </w:r>
-    </w:p>
-    <w:p>
-      <w:r>
-        <w:t>Strength:</w:t>
-      </w:r>
-    </w:p>
-    <w:p>
-      <w:r>
-        <w:t>Popular, feature-rich, widely used in apartment societies.</w:t>
-      </w:r>
-    </w:p>
-    <w:p>
-      <w:r>
-        <w:t>Limitations:</w:t>
-      </w:r>
-    </w:p>
-    <w:p>
-      <w:r>
-        <w:t>Can be more complex and expensive for smaller societies.</w:t>
-      </w:r>
-    </w:p>
-    <w:p/>
-    <w:p>
-      <w:pPr>
-        <w:rPr>
-          <w:b/>
-          <w:bCs/>
-        </w:rPr>
-      </w:pPr>
-      <w:r>
-        <w:rPr>
-          <w:b/>
-          <w:bCs/>
-        </w:rPr>
-        <w:t>2) NoBrokerHood</w:t>
-      </w:r>
-    </w:p>
-    <w:p>
-      <w:r>
-        <w:t>What it offers:</w:t>
-      </w:r>
-    </w:p>
-    <w:p>
-      <w:r>
-        <w:t>Visitor management, maintenance billing, accounting, notices, and resident communication.</w:t>
-      </w:r>
-    </w:p>
-    <w:p>
-      <w:r>
-        <w:t>Strength:</w:t>
-      </w:r>
-    </w:p>
-    <w:p>
-      <w:r>
-        <w:t>Comprehensive solution with mobile app support.</w:t>
-      </w:r>
-    </w:p>
-    <w:p>
-      <w:r>
-        <w:t>Limitations:</w:t>
-      </w:r>
-    </w:p>
-    <w:p>
-      <w:r>
-        <w:t>Includes many advanced features that small societies may not need.</w:t>
-      </w:r>
-    </w:p>
-    <w:p/>
-    <w:p>
-      <w:pPr>
-        <w:rPr>
-          <w:b/>
-          <w:bCs/>
-        </w:rPr>
-      </w:pPr>
-      <w:r>
-        <w:rPr>
-          <w:b/>
-          <w:bCs/>
-        </w:rPr>
-        <w:t>3) ApartmentADDA</w:t>
-      </w:r>
-    </w:p>
-    <w:p>
-      <w:r>
-        <w:t>What it offers:</w:t>
-      </w:r>
-    </w:p>
-    <w:p>
-      <w:r>
-        <w:t>Resident management, accounting, maintenance billing, notices, helpdesk, and reports.</w:t>
-      </w:r>
-    </w:p>
-    <w:p>
-      <w:r>
-        <w:t>Strength:</w:t>
-      </w:r>
-    </w:p>
-    <w:p>
-      <w:r>
-        <w:t>Strong accounting and administrative features.</w:t>
-      </w:r>
-    </w:p>
-    <w:p>
-      <w:r>
-        <w:t>Limitations:</w:t>
-      </w:r>
-    </w:p>
-    <w:p>
-      <w:r>
-        <w:lastRenderedPageBreak/>
-        <w:t>May require training because of its large feature set.</w:t>
-      </w:r>
-    </w:p>
-    <w:p/>
+      </w:pPr>
+    </w:p>
     <w:p>
       <w:pPr>
         <w:rPr>
@@ -1027,17 +1033,195 @@
           <w:szCs w:val="24"/>
         </w:rPr>
       </w:pPr>
-    </w:p>
-    <w:p>
-      <w:pPr>
+      <w:r>
         <w:rPr>
           <w:b/>
           <w:bCs/>
           <w:sz w:val="24"/>
           <w:szCs w:val="24"/>
         </w:rPr>
-      </w:pPr>
-    </w:p>
+        <w:t>Risks</w:t>
+      </w:r>
+    </w:p>
+    <w:p>
+      <w:pPr>
+        <w:pStyle w:val="ListParagraph"/>
+        <w:numPr>
+          <w:ilvl w:val="0"/>
+          <w:numId w:val="53"/>
+        </w:numPr>
+      </w:pPr>
+      <w:r>
+        <w:rPr>
+          <w:b/>
+          <w:bCs/>
+        </w:rPr>
+        <w:t>Data Migration Risk</w:t>
+      </w:r>
+      <w:r>
+        <w:br/>
+        <w:t xml:space="preserve">Existing resident and financial records stored in Excel sheets and manual registers may be incomplete or inconsistent, making migration difficult. </w:t>
+      </w:r>
+    </w:p>
+    <w:p>
+      <w:pPr>
+        <w:pStyle w:val="ListParagraph"/>
+        <w:numPr>
+          <w:ilvl w:val="0"/>
+          <w:numId w:val="53"/>
+        </w:numPr>
+      </w:pPr>
+      <w:r>
+        <w:rPr>
+          <w:b/>
+          <w:bCs/>
+        </w:rPr>
+        <w:t>Data Entry Errors</w:t>
+      </w:r>
+      <w:r>
+        <w:br/>
+        <w:t xml:space="preserve">Incorrect or incomplete information entered by committee members may affect the accuracy of resident records and financial reports. </w:t>
+      </w:r>
+    </w:p>
+    <w:p>
+      <w:pPr>
+        <w:pStyle w:val="ListParagraph"/>
+        <w:numPr>
+          <w:ilvl w:val="0"/>
+          <w:numId w:val="53"/>
+        </w:numPr>
+      </w:pPr>
+      <w:r>
+        <w:rPr>
+          <w:b/>
+          <w:bCs/>
+        </w:rPr>
+        <w:t>User Adoption Risk</w:t>
+      </w:r>
+      <w:r>
+        <w:br/>
+        <w:t xml:space="preserve">Committee members who are accustomed to manual processes may require time and basic training to use the new system effectively. </w:t>
+      </w:r>
+    </w:p>
+    <w:p>
+      <w:pPr>
+        <w:pStyle w:val="ListParagraph"/>
+        <w:numPr>
+          <w:ilvl w:val="0"/>
+          <w:numId w:val="53"/>
+        </w:numPr>
+      </w:pPr>
+      <w:r>
+        <w:rPr>
+          <w:b/>
+          <w:bCs/>
+        </w:rPr>
+        <w:t>Data Security Risk</w:t>
+      </w:r>
+      <w:r>
+        <w:br/>
+        <w:t xml:space="preserve">Unauthorized access to resident and financial information could compromise sensitive society data if proper authentication is not implemented. </w:t>
+      </w:r>
+    </w:p>
+    <w:p>
+      <w:pPr>
+        <w:pStyle w:val="ListParagraph"/>
+        <w:numPr>
+          <w:ilvl w:val="0"/>
+          <w:numId w:val="53"/>
+        </w:numPr>
+      </w:pPr>
+      <w:r>
+        <w:rPr>
+          <w:b/>
+          <w:bCs/>
+        </w:rPr>
+        <w:t>System Reliability Risk</w:t>
+      </w:r>
+      <w:r>
+        <w:br/>
+        <w:t xml:space="preserve">Software bugs or database issues may affect system performance or data availability during the initial release. </w:t>
+      </w:r>
+    </w:p>
+    <w:p>
+      <w:pPr>
+        <w:pStyle w:val="ListParagraph"/>
+        <w:numPr>
+          <w:ilvl w:val="0"/>
+          <w:numId w:val="53"/>
+        </w:numPr>
+      </w:pPr>
+      <w:r>
+        <w:rPr>
+          <w:b/>
+          <w:bCs/>
+        </w:rPr>
+        <w:t>Scalability Risk</w:t>
+      </w:r>
+      <w:r>
+        <w:br/>
+        <w:t xml:space="preserve">As the number of residents and financial records grows, the system may require performance optimization. </w:t>
+      </w:r>
+    </w:p>
+    <w:p>
+      <w:pPr>
+        <w:pStyle w:val="ListParagraph"/>
+        <w:numPr>
+          <w:ilvl w:val="0"/>
+          <w:numId w:val="53"/>
+        </w:numPr>
+      </w:pPr>
+      <w:r>
+        <w:rPr>
+          <w:b/>
+          <w:bCs/>
+        </w:rPr>
+        <w:t>Requirement Changes</w:t>
+      </w:r>
+      <w:r>
+        <w:br/>
+        <w:t>Committee members may request additional features or workflow changes duringdevelopment, which could impact the project timeline.</w:t>
+      </w:r>
+    </w:p>
+    <w:p>
+      <w:pPr>
+        <w:pStyle w:val="ListParagraph"/>
+        <w:numPr>
+          <w:ilvl w:val="0"/>
+          <w:numId w:val="53"/>
+        </w:numPr>
+      </w:pPr>
+      <w:r>
+        <w:rPr>
+          <w:b/>
+          <w:bCs/>
+        </w:rPr>
+        <w:t xml:space="preserve"> AI Response Accuracy: </w:t>
+      </w:r>
+      <w:r>
+        <w:t xml:space="preserve">The AI-generated notice may require manual review to ensure the information is accurate and appropriate before publishing. </w:t>
+      </w:r>
+    </w:p>
+    <w:p>
+      <w:pPr>
+        <w:pStyle w:val="ListParagraph"/>
+        <w:numPr>
+          <w:ilvl w:val="0"/>
+          <w:numId w:val="53"/>
+        </w:numPr>
+      </w:pPr>
+      <w:r>
+        <w:rPr>
+          <w:b/>
+          <w:bCs/>
+        </w:rPr>
+        <w:t>API Availability</w:t>
+      </w:r>
+      <w:r>
+        <w:t>: If the Anthropic API is unavailable or experiences delays, the AI Notice Generator may not function temporarily.</w:t>
+      </w:r>
+    </w:p>
+    <w:p/>
     <w:p>
       <w:pPr>
         <w:rPr>
@@ -1047,239 +1231,13 @@
           <w:szCs w:val="24"/>
         </w:rPr>
       </w:pPr>
-    </w:p>
-    <w:p>
-      <w:pPr>
+      <w:r>
         <w:rPr>
           <w:b/>
           <w:bCs/>
           <w:sz w:val="24"/>
           <w:szCs w:val="24"/>
         </w:rPr>
-      </w:pPr>
-    </w:p>
-    <w:p>
-      <w:pPr>
-        <w:rPr>
-          <w:b/>
-          <w:bCs/>
-          <w:sz w:val="24"/>
-          <w:szCs w:val="24"/>
-        </w:rPr>
-      </w:pPr>
-      <w:r>
-        <w:rPr>
-          <w:b/>
-          <w:bCs/>
-          <w:sz w:val="24"/>
-          <w:szCs w:val="24"/>
-        </w:rPr>
-        <w:t>Risks</w:t>
-      </w:r>
-    </w:p>
-    <w:p>
-      <w:pPr>
-        <w:pStyle w:val="ListParagraph"/>
-        <w:numPr>
-          <w:ilvl w:val="0"/>
-          <w:numId w:val="53"/>
-        </w:numPr>
-      </w:pPr>
-      <w:r>
-        <w:rPr>
-          <w:b/>
-          <w:bCs/>
-        </w:rPr>
-        <w:t>Data Migration Risk</w:t>
-      </w:r>
-      <w:r>
-        <w:br/>
-        <w:t xml:space="preserve">Existing resident and financial records stored in Excel sheets and manual registers may be incomplete or inconsistent, making migration difficult. </w:t>
-      </w:r>
-    </w:p>
-    <w:p>
-      <w:pPr>
-        <w:pStyle w:val="ListParagraph"/>
-        <w:numPr>
-          <w:ilvl w:val="0"/>
-          <w:numId w:val="53"/>
-        </w:numPr>
-      </w:pPr>
-      <w:r>
-        <w:rPr>
-          <w:b/>
-          <w:bCs/>
-        </w:rPr>
-        <w:t>Data Entry Errors</w:t>
-      </w:r>
-      <w:r>
-        <w:br/>
-        <w:t xml:space="preserve">Incorrect or incomplete information entered by committee members may affect the accuracy of resident records and financial reports. </w:t>
-      </w:r>
-    </w:p>
-    <w:p>
-      <w:pPr>
-        <w:pStyle w:val="ListParagraph"/>
-        <w:numPr>
-          <w:ilvl w:val="0"/>
-          <w:numId w:val="53"/>
-        </w:numPr>
-      </w:pPr>
-      <w:r>
-        <w:rPr>
-          <w:b/>
-          <w:bCs/>
-        </w:rPr>
-        <w:t>User Adoption Risk</w:t>
-      </w:r>
-      <w:r>
-        <w:br/>
-        <w:t xml:space="preserve">Committee members who are accustomed to manual processes may require time and basic training to use the new system effectively. </w:t>
-      </w:r>
-    </w:p>
-    <w:p>
-      <w:pPr>
-        <w:pStyle w:val="ListParagraph"/>
-        <w:numPr>
-          <w:ilvl w:val="0"/>
-          <w:numId w:val="53"/>
-        </w:numPr>
-      </w:pPr>
-      <w:r>
-        <w:rPr>
-          <w:b/>
-          <w:bCs/>
-        </w:rPr>
-        <w:t>Data Security Risk</w:t>
-      </w:r>
-      <w:r>
-        <w:br/>
-        <w:t xml:space="preserve">Unauthorized access to resident and financial information could compromise sensitive society data if proper authentication is not implemented. </w:t>
-      </w:r>
-    </w:p>
-    <w:p>
-      <w:pPr>
-        <w:pStyle w:val="ListParagraph"/>
-        <w:numPr>
-          <w:ilvl w:val="0"/>
-          <w:numId w:val="53"/>
-        </w:numPr>
-      </w:pPr>
-      <w:r>
-        <w:rPr>
-          <w:b/>
-          <w:bCs/>
-        </w:rPr>
-        <w:t>System Reliability Risk</w:t>
-      </w:r>
-      <w:r>
-        <w:br/>
-        <w:t xml:space="preserve">Software bugs or database issues may affect system performance or data availability during the initial release. </w:t>
-      </w:r>
-    </w:p>
-    <w:p>
-      <w:pPr>
-        <w:pStyle w:val="ListParagraph"/>
-        <w:numPr>
-          <w:ilvl w:val="0"/>
-          <w:numId w:val="53"/>
-        </w:numPr>
-      </w:pPr>
-      <w:r>
-        <w:rPr>
-          <w:b/>
-          <w:bCs/>
-        </w:rPr>
-        <w:t>Scalability Risk</w:t>
-      </w:r>
-      <w:r>
-        <w:br/>
-        <w:t xml:space="preserve">As the number of residents and financial records grows, the system may require performance optimization. </w:t>
-      </w:r>
-    </w:p>
-    <w:p>
-      <w:pPr>
-        <w:pStyle w:val="ListParagraph"/>
-        <w:numPr>
-          <w:ilvl w:val="0"/>
-          <w:numId w:val="53"/>
-        </w:numPr>
-      </w:pPr>
-      <w:r>
-        <w:rPr>
-          <w:b/>
-          <w:bCs/>
-        </w:rPr>
-        <w:t>Requirement Changes</w:t>
-      </w:r>
-      <w:r>
-        <w:br/>
-        <w:t xml:space="preserve">Committee members may request additional features or workflow changes </w:t>
-      </w:r>
-      <w:proofErr w:type="spellStart"/>
-      <w:r>
-        <w:t>duringdevelopment</w:t>
-      </w:r>
-      <w:proofErr w:type="spellEnd"/>
-      <w:r>
-        <w:t>, which could impact the project timeline.</w:t>
-      </w:r>
-    </w:p>
-    <w:p>
-      <w:pPr>
-        <w:pStyle w:val="ListParagraph"/>
-        <w:numPr>
-          <w:ilvl w:val="0"/>
-          <w:numId w:val="53"/>
-        </w:numPr>
-      </w:pPr>
-      <w:r>
-        <w:rPr>
-          <w:b/>
-          <w:bCs/>
-        </w:rPr>
-        <w:t xml:space="preserve"> AI Response Accuracy: </w:t>
-      </w:r>
-      <w:r>
-        <w:t xml:space="preserve">The AI-generated notice may require manual review to ensure the information is accurate and appropriate before publishing. </w:t>
-      </w:r>
-    </w:p>
-    <w:p>
-      <w:pPr>
-        <w:pStyle w:val="ListParagraph"/>
-        <w:numPr>
-          <w:ilvl w:val="0"/>
-          <w:numId w:val="53"/>
-        </w:numPr>
-      </w:pPr>
-      <w:r>
-        <w:rPr>
-          <w:b/>
-          <w:bCs/>
-        </w:rPr>
-        <w:t>API Availability</w:t>
-      </w:r>
-      <w:r>
-        <w:t>: If the Anthropic API is unavailable or experiences delays, the AI Notice Generator may not function temporarily.</w:t>
-      </w:r>
-    </w:p>
-    <w:p/>
-    <w:p>
-      <w:pPr>
-        <w:rPr>
-          <w:b/>
-          <w:bCs/>
-          <w:sz w:val="24"/>
-          <w:szCs w:val="24"/>
-        </w:rPr>
-      </w:pPr>
-      <w:r>
-        <w:rPr>
-          <w:b/>
-          <w:bCs/>
-          <w:sz w:val="24"/>
-          <w:szCs w:val="24"/>
-        </w:rPr>
         <w:t>MVP SCOPE</w:t>
       </w:r>
     </w:p>
@@ -1337,51 +1295,51 @@
         <w:rPr>
           <w:rFonts w:ascii="Segoe UI Emoji" w:hAnsi="Segoe UI Emoji" w:cs="Segoe UI Emoji"/>
         </w:rPr>
+        <w:t>2)</w:t>
+      </w:r>
+      <w:r>
+        <w:t xml:space="preserve"> Maintenance Management</w:t>
+      </w:r>
+    </w:p>
+    <w:p>
+      <w:pPr>
+        <w:numPr>
+          <w:ilvl w:val="0"/>
+          <w:numId w:val="8"/>
+        </w:numPr>
+      </w:pPr>
+      <w:r>
+        <w:t xml:space="preserve">Record maintenance payments </w:t>
+      </w:r>
+    </w:p>
+    <w:p>
+      <w:pPr>
+        <w:numPr>
+          <w:ilvl w:val="0"/>
+          <w:numId w:val="8"/>
+        </w:numPr>
+      </w:pPr>
+      <w:r>
+        <w:t xml:space="preserve">View payment history </w:t>
+      </w:r>
+    </w:p>
+    <w:p>
+      <w:pPr>
+        <w:numPr>
+          <w:ilvl w:val="0"/>
+          <w:numId w:val="8"/>
+        </w:numPr>
+      </w:pPr>
+      <w:r>
+        <w:t xml:space="preserve">Track paid and pending dues </w:t>
+      </w:r>
+    </w:p>
+    <w:p>
+      <w:r>
+        <w:rPr>
+          <w:rFonts w:ascii="Segoe UI Emoji" w:hAnsi="Segoe UI Emoji" w:cs="Segoe UI Emoji"/>
+        </w:rPr>
         <w:lastRenderedPageBreak/>
-        <w:t>2)</w:t>
-      </w:r>
-      <w:r>
-        <w:t xml:space="preserve"> Maintenance Management</w:t>
-      </w:r>
-    </w:p>
-    <w:p>
-      <w:pPr>
-        <w:numPr>
-          <w:ilvl w:val="0"/>
-          <w:numId w:val="8"/>
-        </w:numPr>
-      </w:pPr>
-      <w:r>
-        <w:t xml:space="preserve">Record maintenance payments </w:t>
-      </w:r>
-    </w:p>
-    <w:p>
-      <w:pPr>
-        <w:numPr>
-          <w:ilvl w:val="0"/>
-          <w:numId w:val="8"/>
-        </w:numPr>
-      </w:pPr>
-      <w:r>
-        <w:t xml:space="preserve">View payment history </w:t>
-      </w:r>
-    </w:p>
-    <w:p>
-      <w:pPr>
-        <w:numPr>
-          <w:ilvl w:val="0"/>
-          <w:numId w:val="8"/>
-        </w:numPr>
-      </w:pPr>
-      <w:r>
-        <w:t xml:space="preserve">Track paid and pending dues </w:t>
-      </w:r>
-    </w:p>
-    <w:p>
-      <w:r>
-        <w:rPr>
-          <w:rFonts w:ascii="Segoe UI Emoji" w:hAnsi="Segoe UI Emoji" w:cs="Segoe UI Emoji"/>
-        </w:rPr>
         <w:t>3)</w:t>
       </w:r>
       <w:r>
@@ -1680,7 +1638,6 @@
         <w:rPr>
           <w:rFonts w:ascii="Segoe UI Emoji" w:hAnsi="Segoe UI Emoji" w:cs="Segoe UI Emoji"/>
         </w:rPr>
-        <w:lastRenderedPageBreak/>
         <w:t>4)</w:t>
       </w:r>
       <w:r>
@@ -2037,55 +1994,55 @@
         </w:numPr>
       </w:pPr>
       <w:r>
+        <w:t xml:space="preserve">The interface should be simple and easy to use. </w:t>
+      </w:r>
+    </w:p>
+    <w:p>
+      <w:pPr>
+        <w:numPr>
+          <w:ilvl w:val="0"/>
+          <w:numId w:val="13"/>
+        </w:numPr>
+      </w:pPr>
+      <w:r>
+        <w:t xml:space="preserve">Navigation should be clear and intuitive. </w:t>
+      </w:r>
+    </w:p>
+    <w:p>
+      <w:pPr>
+        <w:rPr>
+          <w:b/>
+          <w:bCs/>
+        </w:rPr>
+      </w:pPr>
+      <w:r>
+        <w:rPr>
+          <w:b/>
+          <w:bCs/>
+        </w:rPr>
+        <w:t>Security</w:t>
+      </w:r>
+    </w:p>
+    <w:p>
+      <w:pPr>
+        <w:numPr>
+          <w:ilvl w:val="0"/>
+          <w:numId w:val="14"/>
+        </w:numPr>
+      </w:pPr>
+      <w:r>
+        <w:t xml:space="preserve">Only authorized committee members should be able to log in. </w:t>
+      </w:r>
+    </w:p>
+    <w:p>
+      <w:pPr>
+        <w:numPr>
+          <w:ilvl w:val="0"/>
+          <w:numId w:val="14"/>
+        </w:numPr>
+      </w:pPr>
+      <w:r>
         <w:lastRenderedPageBreak/>
-        <w:t xml:space="preserve">The interface should be simple and easy to use. </w:t>
-      </w:r>
-    </w:p>
-    <w:p>
-      <w:pPr>
-        <w:numPr>
-          <w:ilvl w:val="0"/>
-          <w:numId w:val="13"/>
-        </w:numPr>
-      </w:pPr>
-      <w:r>
-        <w:t xml:space="preserve">Navigation should be clear and intuitive. </w:t>
-      </w:r>
-    </w:p>
-    <w:p>
-      <w:pPr>
-        <w:rPr>
-          <w:b/>
-          <w:bCs/>
-        </w:rPr>
-      </w:pPr>
-      <w:r>
-        <w:rPr>
-          <w:b/>
-          <w:bCs/>
-        </w:rPr>
-        <w:t>Security</w:t>
-      </w:r>
-    </w:p>
-    <w:p>
-      <w:pPr>
-        <w:numPr>
-          <w:ilvl w:val="0"/>
-          <w:numId w:val="14"/>
-        </w:numPr>
-      </w:pPr>
-      <w:r>
-        <w:t xml:space="preserve">Only authorized committee members should be able to log in. </w:t>
-      </w:r>
-    </w:p>
-    <w:p>
-      <w:pPr>
-        <w:numPr>
-          <w:ilvl w:val="0"/>
-          <w:numId w:val="14"/>
-        </w:numPr>
-      </w:pPr>
-      <w:r>
         <w:t xml:space="preserve">Passwords should be stored securely. </w:t>
       </w:r>
     </w:p>
@@ -2519,69 +2476,69 @@
           <w:b/>
           <w:bCs/>
         </w:rPr>
+        <w:t>When</w:t>
+      </w:r>
+      <w:r>
+        <w:t xml:space="preserve"> I enter a valid email/username and password and click </w:t>
+      </w:r>
+      <w:r>
+        <w:rPr>
+          <w:b/>
+          <w:bCs/>
+        </w:rPr>
+        <w:t>Login</w:t>
+      </w:r>
+      <w:r>
+        <w:t xml:space="preserve">, </w:t>
+      </w:r>
+    </w:p>
+    <w:p>
+      <w:pPr>
+        <w:numPr>
+          <w:ilvl w:val="0"/>
+          <w:numId w:val="21"/>
+        </w:numPr>
+      </w:pPr>
+      <w:r>
+        <w:rPr>
+          <w:b/>
+          <w:bCs/>
+        </w:rPr>
+        <w:t>Then</w:t>
+      </w:r>
+      <w:r>
+        <w:t xml:space="preserve"> I should be redirected to the dashboard. </w:t>
+      </w:r>
+    </w:p>
+    <w:p/>
+    <w:p>
+      <w:pPr>
+        <w:rPr>
+          <w:b/>
+          <w:bCs/>
+        </w:rPr>
+      </w:pPr>
+      <w:r>
+        <w:rPr>
+          <w:b/>
+          <w:bCs/>
+        </w:rPr>
+        <w:t>3) Invalid Login</w:t>
+      </w:r>
+    </w:p>
+    <w:p>
+      <w:pPr>
+        <w:rPr>
+          <w:b/>
+          <w:bCs/>
+        </w:rPr>
+      </w:pPr>
+      <w:r>
+        <w:rPr>
+          <w:b/>
+          <w:bCs/>
+        </w:rPr>
         <w:lastRenderedPageBreak/>
-        <w:t>When</w:t>
-      </w:r>
-      <w:r>
-        <w:t xml:space="preserve"> I enter a valid email/username and password and click </w:t>
-      </w:r>
-      <w:r>
-        <w:rPr>
-          <w:b/>
-          <w:bCs/>
-        </w:rPr>
-        <w:t>Login</w:t>
-      </w:r>
-      <w:r>
-        <w:t xml:space="preserve">, </w:t>
-      </w:r>
-    </w:p>
-    <w:p>
-      <w:pPr>
-        <w:numPr>
-          <w:ilvl w:val="0"/>
-          <w:numId w:val="21"/>
-        </w:numPr>
-      </w:pPr>
-      <w:r>
-        <w:rPr>
-          <w:b/>
-          <w:bCs/>
-        </w:rPr>
-        <w:t>Then</w:t>
-      </w:r>
-      <w:r>
-        <w:t xml:space="preserve"> I should be redirected to the dashboard. </w:t>
-      </w:r>
-    </w:p>
-    <w:p/>
-    <w:p>
-      <w:pPr>
-        <w:rPr>
-          <w:b/>
-          <w:bCs/>
-        </w:rPr>
-      </w:pPr>
-      <w:r>
-        <w:rPr>
-          <w:b/>
-          <w:bCs/>
-        </w:rPr>
-        <w:t>3) Invalid Login</w:t>
-      </w:r>
-    </w:p>
-    <w:p>
-      <w:pPr>
-        <w:rPr>
-          <w:b/>
-          <w:bCs/>
-        </w:rPr>
-      </w:pPr>
-      <w:r>
-        <w:rPr>
-          <w:b/>
-          <w:bCs/>
-        </w:rPr>
         <w:t>User Story</w:t>
       </w:r>
     </w:p>
@@ -2910,426 +2867,426 @@
           <w:b/>
           <w:bCs/>
         </w:rPr>
+        <w:t>User Story:</w:t>
+      </w:r>
+      <w:r>
+        <w:br/>
+        <w:t>As a Society Treasurer, I want to search for resident records so that I can quickly find the required information.</w:t>
+      </w:r>
+    </w:p>
+    <w:p>
+      <w:r>
+        <w:rPr>
+          <w:b/>
+          <w:bCs/>
+        </w:rPr>
+        <w:t>Acceptance Criteria</w:t>
+      </w:r>
+    </w:p>
+    <w:p>
+      <w:pPr>
+        <w:numPr>
+          <w:ilvl w:val="0"/>
+          <w:numId w:val="25"/>
+        </w:numPr>
+      </w:pPr>
+      <w:r>
+        <w:rPr>
+          <w:b/>
+          <w:bCs/>
+        </w:rPr>
+        <w:t>Given</w:t>
+      </w:r>
+      <w:r>
+        <w:t xml:space="preserve"> resident records are available, </w:t>
+      </w:r>
+    </w:p>
+    <w:p>
+      <w:pPr>
+        <w:numPr>
+          <w:ilvl w:val="0"/>
+          <w:numId w:val="25"/>
+        </w:numPr>
+      </w:pPr>
+      <w:r>
+        <w:rPr>
+          <w:b/>
+          <w:bCs/>
+        </w:rPr>
+        <w:t>When</w:t>
+      </w:r>
+      <w:r>
+        <w:t xml:space="preserve"> I search by name or flat number, </w:t>
+      </w:r>
+    </w:p>
+    <w:p>
+      <w:pPr>
+        <w:numPr>
+          <w:ilvl w:val="0"/>
+          <w:numId w:val="25"/>
+        </w:numPr>
+      </w:pPr>
+      <w:r>
+        <w:rPr>
+          <w:b/>
+          <w:bCs/>
+        </w:rPr>
+        <w:lastRenderedPageBreak/>
+        <w:t>Then</w:t>
+      </w:r>
+      <w:r>
+        <w:t xml:space="preserve"> the matching resident details should be displayed. </w:t>
+      </w:r>
+    </w:p>
+    <w:p/>
+    <w:p>
+      <w:pPr>
+        <w:rPr>
+          <w:b/>
+          <w:bCs/>
+        </w:rPr>
+      </w:pPr>
+      <w:r>
+        <w:rPr>
+          <w:rFonts w:ascii="Segoe UI Emoji" w:hAnsi="Segoe UI Emoji" w:cs="Segoe UI Emoji"/>
+          <w:b/>
+          <w:bCs/>
+        </w:rPr>
+        <w:t>5)</w:t>
+      </w:r>
+      <w:r>
+        <w:rPr>
+          <w:b/>
+          <w:bCs/>
+        </w:rPr>
+        <w:t xml:space="preserve"> Maintenance Management</w:t>
+      </w:r>
+    </w:p>
+    <w:p>
+      <w:pPr>
+        <w:rPr>
+          <w:b/>
+          <w:bCs/>
+        </w:rPr>
+      </w:pPr>
+      <w:r>
+        <w:rPr>
+          <w:b/>
+          <w:bCs/>
+        </w:rPr>
+        <w:t>1. Record Maintenance Payment</w:t>
+      </w:r>
+    </w:p>
+    <w:p>
+      <w:r>
+        <w:rPr>
+          <w:b/>
+          <w:bCs/>
+        </w:rPr>
+        <w:t>User Story:</w:t>
+      </w:r>
+      <w:r>
+        <w:br/>
+        <w:t>As a Society Treasurer, I want to record maintenance payments so that I can keep track of residents' payments.</w:t>
+      </w:r>
+    </w:p>
+    <w:p>
+      <w:r>
+        <w:rPr>
+          <w:b/>
+          <w:bCs/>
+        </w:rPr>
+        <w:t>Acceptance Criteria</w:t>
+      </w:r>
+    </w:p>
+    <w:p>
+      <w:pPr>
+        <w:numPr>
+          <w:ilvl w:val="0"/>
+          <w:numId w:val="26"/>
+        </w:numPr>
+      </w:pPr>
+      <w:r>
+        <w:rPr>
+          <w:b/>
+          <w:bCs/>
+        </w:rPr>
+        <w:t>Given</w:t>
+      </w:r>
+      <w:r>
+        <w:t xml:space="preserve"> a resident exists, </w:t>
+      </w:r>
+    </w:p>
+    <w:p>
+      <w:pPr>
+        <w:numPr>
+          <w:ilvl w:val="0"/>
+          <w:numId w:val="26"/>
+        </w:numPr>
+      </w:pPr>
+      <w:r>
+        <w:rPr>
+          <w:b/>
+          <w:bCs/>
+        </w:rPr>
+        <w:t>When</w:t>
+      </w:r>
+      <w:r>
+        <w:t xml:space="preserve"> I record a maintenance payment, </w:t>
+      </w:r>
+    </w:p>
+    <w:p>
+      <w:pPr>
+        <w:numPr>
+          <w:ilvl w:val="0"/>
+          <w:numId w:val="26"/>
+        </w:numPr>
+      </w:pPr>
+      <w:r>
+        <w:rPr>
+          <w:b/>
+          <w:bCs/>
+        </w:rPr>
+        <w:t>Then</w:t>
+      </w:r>
+      <w:r>
+        <w:t xml:space="preserve"> the payment should be saved successfully. </w:t>
+      </w:r>
+    </w:p>
+    <w:p/>
+    <w:p>
+      <w:pPr>
+        <w:rPr>
+          <w:b/>
+          <w:bCs/>
+        </w:rPr>
+      </w:pPr>
+      <w:r>
+        <w:rPr>
+          <w:b/>
+          <w:bCs/>
+        </w:rPr>
+        <w:t>2. View Payment History</w:t>
+      </w:r>
+    </w:p>
+    <w:p>
+      <w:r>
+        <w:rPr>
+          <w:b/>
+          <w:bCs/>
+        </w:rPr>
+        <w:t>User Story:</w:t>
+      </w:r>
+      <w:r>
+        <w:br/>
+        <w:t>As a Society Treasurer, I want to view payment history so that I can verify previous maintenance transactions.</w:t>
+      </w:r>
+    </w:p>
+    <w:p>
+      <w:r>
+        <w:rPr>
+          <w:b/>
+          <w:bCs/>
+        </w:rPr>
+        <w:t>Acceptance Criteria</w:t>
+      </w:r>
+    </w:p>
+    <w:p>
+      <w:pPr>
+        <w:numPr>
+          <w:ilvl w:val="0"/>
+          <w:numId w:val="27"/>
+        </w:numPr>
+      </w:pPr>
+      <w:r>
+        <w:rPr>
+          <w:b/>
+          <w:bCs/>
+        </w:rPr>
+        <w:t>Given</w:t>
+      </w:r>
+      <w:r>
+        <w:t xml:space="preserve"> payment records are available, </w:t>
+      </w:r>
+    </w:p>
+    <w:p>
+      <w:pPr>
+        <w:numPr>
+          <w:ilvl w:val="0"/>
+          <w:numId w:val="27"/>
+        </w:numPr>
+      </w:pPr>
+      <w:r>
+        <w:rPr>
+          <w:b/>
+          <w:bCs/>
+        </w:rPr>
+        <w:t>When</w:t>
+      </w:r>
+      <w:r>
+        <w:t xml:space="preserve"> I open the payment history, </w:t>
+      </w:r>
+    </w:p>
+    <w:p>
+      <w:pPr>
+        <w:numPr>
+          <w:ilvl w:val="0"/>
+          <w:numId w:val="27"/>
+        </w:numPr>
+      </w:pPr>
+      <w:r>
+        <w:rPr>
+          <w:b/>
+          <w:bCs/>
+        </w:rPr>
+        <w:t>Then</w:t>
+      </w:r>
+      <w:r>
+        <w:t xml:space="preserve"> all maintenance transactions should be displayed. </w:t>
+      </w:r>
+    </w:p>
+    <w:p/>
+    <w:p>
+      <w:pPr>
+        <w:rPr>
+          <w:b/>
+          <w:bCs/>
+        </w:rPr>
+      </w:pPr>
+      <w:r>
+        <w:rPr>
+          <w:b/>
+          <w:bCs/>
+        </w:rPr>
+        <w:t>3. Track Pending Dues</w:t>
+      </w:r>
+    </w:p>
+    <w:p>
+      <w:r>
+        <w:rPr>
+          <w:b/>
+          <w:bCs/>
+        </w:rPr>
+        <w:t>User Story:</w:t>
+      </w:r>
+      <w:r>
+        <w:br/>
+        <w:t>As a Society Treasurer, I want to identify pending maintenance dues so that I can follow up with residents.</w:t>
+      </w:r>
+    </w:p>
+    <w:p>
+      <w:r>
+        <w:rPr>
+          <w:b/>
+          <w:bCs/>
+        </w:rPr>
+        <w:t>Acceptance Criteria</w:t>
+      </w:r>
+    </w:p>
+    <w:p>
+      <w:pPr>
+        <w:numPr>
+          <w:ilvl w:val="0"/>
+          <w:numId w:val="28"/>
+        </w:numPr>
+      </w:pPr>
+      <w:r>
+        <w:rPr>
+          <w:b/>
+          <w:bCs/>
+        </w:rPr>
+        <w:t>Given</w:t>
+      </w:r>
+      <w:r>
+        <w:t xml:space="preserve"> some residents have unpaid maintenance, </w:t>
+      </w:r>
+    </w:p>
+    <w:p>
+      <w:pPr>
+        <w:numPr>
+          <w:ilvl w:val="0"/>
+          <w:numId w:val="28"/>
+        </w:numPr>
+      </w:pPr>
+      <w:r>
+        <w:rPr>
+          <w:b/>
+          <w:bCs/>
+        </w:rPr>
+        <w:t>When</w:t>
+      </w:r>
+      <w:r>
+        <w:t xml:space="preserve"> I view pending dues, </w:t>
+      </w:r>
+    </w:p>
+    <w:p>
+      <w:pPr>
+        <w:numPr>
+          <w:ilvl w:val="0"/>
+          <w:numId w:val="28"/>
+        </w:numPr>
+      </w:pPr>
+      <w:r>
+        <w:rPr>
+          <w:b/>
+          <w:bCs/>
+        </w:rPr>
+        <w:t>Then</w:t>
+      </w:r>
+      <w:r>
+        <w:t xml:space="preserve"> the system should display all pending payments. </w:t>
+      </w:r>
+    </w:p>
+    <w:p/>
+    <w:p>
+      <w:pPr>
+        <w:rPr>
+          <w:b/>
+          <w:bCs/>
+        </w:rPr>
+      </w:pPr>
+      <w:r>
+        <w:rPr>
+          <w:rFonts w:ascii="Segoe UI Emoji" w:hAnsi="Segoe UI Emoji" w:cs="Segoe UI Emoji"/>
+          <w:b/>
+          <w:bCs/>
+        </w:rPr>
+        <w:t>6)</w:t>
+      </w:r>
+      <w:r>
+        <w:rPr>
+          <w:b/>
+          <w:bCs/>
+        </w:rPr>
+        <w:t xml:space="preserve"> Accounting &amp; Financial Statements</w:t>
+      </w:r>
+    </w:p>
+    <w:p>
+      <w:pPr>
+        <w:rPr>
+          <w:b/>
+          <w:bCs/>
+        </w:rPr>
+      </w:pPr>
+      <w:r>
+        <w:rPr>
+          <w:b/>
+          <w:bCs/>
+        </w:rPr>
+        <w:t>1. Record Income &amp; Expenses</w:t>
+      </w:r>
+    </w:p>
+    <w:p>
+      <w:r>
+        <w:rPr>
+          <w:b/>
+          <w:bCs/>
+        </w:rPr>
         <w:lastRenderedPageBreak/>
         <w:t>User Story:</w:t>
       </w:r>
       <w:r>
         <w:br/>
-        <w:t>As a Society Treasurer, I want to search for resident records so that I can quickly find the required information.</w:t>
-      </w:r>
-    </w:p>
-    <w:p>
-      <w:r>
-        <w:rPr>
-          <w:b/>
-          <w:bCs/>
-        </w:rPr>
-        <w:t>Acceptance Criteria</w:t>
-      </w:r>
-    </w:p>
-    <w:p>
-      <w:pPr>
-        <w:numPr>
-          <w:ilvl w:val="0"/>
-          <w:numId w:val="25"/>
-        </w:numPr>
-      </w:pPr>
-      <w:r>
-        <w:rPr>
-          <w:b/>
-          <w:bCs/>
-        </w:rPr>
-        <w:t>Given</w:t>
-      </w:r>
-      <w:r>
-        <w:t xml:space="preserve"> resident records are available, </w:t>
-      </w:r>
-    </w:p>
-    <w:p>
-      <w:pPr>
-        <w:numPr>
-          <w:ilvl w:val="0"/>
-          <w:numId w:val="25"/>
-        </w:numPr>
-      </w:pPr>
-      <w:r>
-        <w:rPr>
-          <w:b/>
-          <w:bCs/>
-        </w:rPr>
-        <w:t>When</w:t>
-      </w:r>
-      <w:r>
-        <w:t xml:space="preserve"> I search by name or flat number, </w:t>
-      </w:r>
-    </w:p>
-    <w:p>
-      <w:pPr>
-        <w:numPr>
-          <w:ilvl w:val="0"/>
-          <w:numId w:val="25"/>
-        </w:numPr>
-      </w:pPr>
-      <w:r>
-        <w:rPr>
-          <w:b/>
-          <w:bCs/>
-        </w:rPr>
-        <w:t>Then</w:t>
-      </w:r>
-      <w:r>
-        <w:t xml:space="preserve"> the matching resident details should be displayed. </w:t>
-      </w:r>
-    </w:p>
-    <w:p/>
-    <w:p>
-      <w:pPr>
-        <w:rPr>
-          <w:b/>
-          <w:bCs/>
-        </w:rPr>
-      </w:pPr>
-      <w:r>
-        <w:rPr>
-          <w:rFonts w:ascii="Segoe UI Emoji" w:hAnsi="Segoe UI Emoji" w:cs="Segoe UI Emoji"/>
-          <w:b/>
-          <w:bCs/>
-        </w:rPr>
-        <w:t>5)</w:t>
-      </w:r>
-      <w:r>
-        <w:rPr>
-          <w:b/>
-          <w:bCs/>
-        </w:rPr>
-        <w:t xml:space="preserve"> Maintenance Management</w:t>
-      </w:r>
-    </w:p>
-    <w:p>
-      <w:pPr>
-        <w:rPr>
-          <w:b/>
-          <w:bCs/>
-        </w:rPr>
-      </w:pPr>
-      <w:r>
-        <w:rPr>
-          <w:b/>
-          <w:bCs/>
-        </w:rPr>
-        <w:t>1. Record Maintenance Payment</w:t>
-      </w:r>
-    </w:p>
-    <w:p>
-      <w:r>
-        <w:rPr>
-          <w:b/>
-          <w:bCs/>
-        </w:rPr>
-        <w:t>User Story:</w:t>
-      </w:r>
-      <w:r>
-        <w:br/>
-        <w:t>As a Society Treasurer, I want to record maintenance payments so that I can keep track of residents' payments.</w:t>
-      </w:r>
-    </w:p>
-    <w:p>
-      <w:r>
-        <w:rPr>
-          <w:b/>
-          <w:bCs/>
-        </w:rPr>
-        <w:t>Acceptance Criteria</w:t>
-      </w:r>
-    </w:p>
-    <w:p>
-      <w:pPr>
-        <w:numPr>
-          <w:ilvl w:val="0"/>
-          <w:numId w:val="26"/>
-        </w:numPr>
-      </w:pPr>
-      <w:r>
-        <w:rPr>
-          <w:b/>
-          <w:bCs/>
-        </w:rPr>
-        <w:t>Given</w:t>
-      </w:r>
-      <w:r>
-        <w:t xml:space="preserve"> a resident exists, </w:t>
-      </w:r>
-    </w:p>
-    <w:p>
-      <w:pPr>
-        <w:numPr>
-          <w:ilvl w:val="0"/>
-          <w:numId w:val="26"/>
-        </w:numPr>
-      </w:pPr>
-      <w:r>
-        <w:rPr>
-          <w:b/>
-          <w:bCs/>
-        </w:rPr>
-        <w:t>When</w:t>
-      </w:r>
-      <w:r>
-        <w:t xml:space="preserve"> I record a maintenance payment, </w:t>
-      </w:r>
-    </w:p>
-    <w:p>
-      <w:pPr>
-        <w:numPr>
-          <w:ilvl w:val="0"/>
-          <w:numId w:val="26"/>
-        </w:numPr>
-      </w:pPr>
-      <w:r>
-        <w:rPr>
-          <w:b/>
-          <w:bCs/>
-        </w:rPr>
-        <w:t>Then</w:t>
-      </w:r>
-      <w:r>
-        <w:t xml:space="preserve"> the payment should be saved successfully. </w:t>
-      </w:r>
-    </w:p>
-    <w:p/>
-    <w:p>
-      <w:pPr>
-        <w:rPr>
-          <w:b/>
-          <w:bCs/>
-        </w:rPr>
-      </w:pPr>
-      <w:r>
-        <w:rPr>
-          <w:b/>
-          <w:bCs/>
-        </w:rPr>
-        <w:t>2. View Payment History</w:t>
-      </w:r>
-    </w:p>
-    <w:p>
-      <w:r>
-        <w:rPr>
-          <w:b/>
-          <w:bCs/>
-        </w:rPr>
-        <w:t>User Story:</w:t>
-      </w:r>
-      <w:r>
-        <w:br/>
-        <w:t>As a Society Treasurer, I want to view payment history so that I can verify previous maintenance transactions.</w:t>
-      </w:r>
-    </w:p>
-    <w:p>
-      <w:r>
-        <w:rPr>
-          <w:b/>
-          <w:bCs/>
-        </w:rPr>
-        <w:t>Acceptance Criteria</w:t>
-      </w:r>
-    </w:p>
-    <w:p>
-      <w:pPr>
-        <w:numPr>
-          <w:ilvl w:val="0"/>
-          <w:numId w:val="27"/>
-        </w:numPr>
-      </w:pPr>
-      <w:r>
-        <w:rPr>
-          <w:b/>
-          <w:bCs/>
-        </w:rPr>
-        <w:t>Given</w:t>
-      </w:r>
-      <w:r>
-        <w:t xml:space="preserve"> payment records are available, </w:t>
-      </w:r>
-    </w:p>
-    <w:p>
-      <w:pPr>
-        <w:numPr>
-          <w:ilvl w:val="0"/>
-          <w:numId w:val="27"/>
-        </w:numPr>
-      </w:pPr>
-      <w:r>
-        <w:rPr>
-          <w:b/>
-          <w:bCs/>
-        </w:rPr>
-        <w:t>When</w:t>
-      </w:r>
-      <w:r>
-        <w:t xml:space="preserve"> I open the payment history, </w:t>
-      </w:r>
-    </w:p>
-    <w:p>
-      <w:pPr>
-        <w:numPr>
-          <w:ilvl w:val="0"/>
-          <w:numId w:val="27"/>
-        </w:numPr>
-      </w:pPr>
-      <w:r>
-        <w:rPr>
-          <w:b/>
-          <w:bCs/>
-        </w:rPr>
-        <w:t>Then</w:t>
-      </w:r>
-      <w:r>
-        <w:t xml:space="preserve"> all maintenance transactions should be displayed. </w:t>
-      </w:r>
-    </w:p>
-    <w:p/>
-    <w:p>
-      <w:pPr>
-        <w:rPr>
-          <w:b/>
-          <w:bCs/>
-        </w:rPr>
-      </w:pPr>
-      <w:r>
-        <w:rPr>
-          <w:b/>
-          <w:bCs/>
-        </w:rPr>
-        <w:t>3. Track Pending Dues</w:t>
-      </w:r>
-    </w:p>
-    <w:p>
-      <w:r>
-        <w:rPr>
-          <w:b/>
-          <w:bCs/>
-        </w:rPr>
-        <w:t>User Story:</w:t>
-      </w:r>
-      <w:r>
-        <w:br/>
-        <w:t>As a Society Treasurer, I want to identify pending maintenance dues so that I can follow up with residents.</w:t>
-      </w:r>
-    </w:p>
-    <w:p>
-      <w:r>
-        <w:rPr>
-          <w:b/>
-          <w:bCs/>
-        </w:rPr>
-        <w:t>Acceptance Criteria</w:t>
-      </w:r>
-    </w:p>
-    <w:p>
-      <w:pPr>
-        <w:numPr>
-          <w:ilvl w:val="0"/>
-          <w:numId w:val="28"/>
-        </w:numPr>
-      </w:pPr>
-      <w:r>
-        <w:rPr>
-          <w:b/>
-          <w:bCs/>
-        </w:rPr>
-        <w:t>Given</w:t>
-      </w:r>
-      <w:r>
-        <w:t xml:space="preserve"> some residents have unpaid maintenance, </w:t>
-      </w:r>
-    </w:p>
-    <w:p>
-      <w:pPr>
-        <w:numPr>
-          <w:ilvl w:val="0"/>
-          <w:numId w:val="28"/>
-        </w:numPr>
-      </w:pPr>
-      <w:r>
-        <w:rPr>
-          <w:b/>
-          <w:bCs/>
-        </w:rPr>
-        <w:t>When</w:t>
-      </w:r>
-      <w:r>
-        <w:t xml:space="preserve"> I view pending dues, </w:t>
-      </w:r>
-    </w:p>
-    <w:p>
-      <w:pPr>
-        <w:numPr>
-          <w:ilvl w:val="0"/>
-          <w:numId w:val="28"/>
-        </w:numPr>
-      </w:pPr>
-      <w:r>
-        <w:rPr>
-          <w:b/>
-          <w:bCs/>
-        </w:rPr>
-        <w:lastRenderedPageBreak/>
-        <w:t>Then</w:t>
-      </w:r>
-      <w:r>
-        <w:t xml:space="preserve"> the system should display all pending payments. </w:t>
-      </w:r>
-    </w:p>
-    <w:p/>
-    <w:p>
-      <w:pPr>
-        <w:rPr>
-          <w:b/>
-          <w:bCs/>
-        </w:rPr>
-      </w:pPr>
-      <w:r>
-        <w:rPr>
-          <w:rFonts w:ascii="Segoe UI Emoji" w:hAnsi="Segoe UI Emoji" w:cs="Segoe UI Emoji"/>
-          <w:b/>
-          <w:bCs/>
-        </w:rPr>
-        <w:t>6)</w:t>
-      </w:r>
-      <w:r>
-        <w:rPr>
-          <w:b/>
-          <w:bCs/>
-        </w:rPr>
-        <w:t xml:space="preserve"> Accounting &amp; Financial Statements</w:t>
-      </w:r>
-    </w:p>
-    <w:p>
-      <w:pPr>
-        <w:rPr>
-          <w:b/>
-          <w:bCs/>
-        </w:rPr>
-      </w:pPr>
-      <w:r>
-        <w:rPr>
-          <w:b/>
-          <w:bCs/>
-        </w:rPr>
-        <w:t>1. Record Income &amp; Expenses</w:t>
-      </w:r>
-    </w:p>
-    <w:p>
-      <w:r>
-        <w:rPr>
-          <w:b/>
-          <w:bCs/>
-        </w:rPr>
-        <w:t>User Story:</w:t>
-      </w:r>
-      <w:r>
-        <w:br/>
         <w:t>As a Society Treasurer, I want to record society income and expenses so that I can maintain accurate financial records.</w:t>
       </w:r>
     </w:p>
@@ -3625,7 +3582,6 @@
           <w:b/>
           <w:bCs/>
         </w:rPr>
-        <w:lastRenderedPageBreak/>
         <w:t>User Story:</w:t>
       </w:r>
       <w:r>
@@ -3690,6 +3646,7 @@
           <w:b/>
           <w:bCs/>
         </w:rPr>
+        <w:lastRenderedPageBreak/>
         <w:t>Then</w:t>
       </w:r>
       <w:r>
@@ -4033,7 +3990,6 @@
           <w:b/>
           <w:bCs/>
         </w:rPr>
-        <w:lastRenderedPageBreak/>
         <w:t xml:space="preserve">When </w:t>
       </w:r>
       <w:r>
@@ -4107,6 +4063,7 @@
           <w:b/>
           <w:bCs/>
         </w:rPr>
+        <w:lastRenderedPageBreak/>
         <w:t>Must Have</w:t>
       </w:r>
     </w:p>
@@ -4381,63 +4338,63 @@
         </w:numPr>
       </w:pPr>
       <w:r>
+        <w:t xml:space="preserve">Email/SMS/WhatsApp Notifications </w:t>
+      </w:r>
+    </w:p>
+    <w:p>
+      <w:pPr>
+        <w:numPr>
+          <w:ilvl w:val="0"/>
+          <w:numId w:val="38"/>
+        </w:numPr>
+      </w:pPr>
+      <w:r>
+        <w:t xml:space="preserve">Parking Management </w:t>
+      </w:r>
+    </w:p>
+    <w:p>
+      <w:pPr>
+        <w:numPr>
+          <w:ilvl w:val="0"/>
+          <w:numId w:val="38"/>
+        </w:numPr>
+      </w:pPr>
+      <w:r>
+        <w:t xml:space="preserve">Multi-Society Support </w:t>
+      </w:r>
+    </w:p>
+    <w:p>
+      <w:pPr>
+        <w:numPr>
+          <w:ilvl w:val="0"/>
+          <w:numId w:val="38"/>
+        </w:numPr>
+      </w:pPr>
+      <w:r>
+        <w:t>Role-Based Access Control</w:t>
+      </w:r>
+    </w:p>
+    <w:p>
+      <w:pPr>
+        <w:rPr>
+          <w:b/>
+          <w:bCs/>
+        </w:rPr>
+      </w:pPr>
+    </w:p>
+    <w:p>
+      <w:pPr>
+        <w:rPr>
+          <w:b/>
+          <w:bCs/>
+        </w:rPr>
+      </w:pPr>
+      <w:r>
+        <w:rPr>
+          <w:b/>
+          <w:bCs/>
+        </w:rPr>
         <w:lastRenderedPageBreak/>
-        <w:t xml:space="preserve">Email/SMS/WhatsApp Notifications </w:t>
-      </w:r>
-    </w:p>
-    <w:p>
-      <w:pPr>
-        <w:numPr>
-          <w:ilvl w:val="0"/>
-          <w:numId w:val="38"/>
-        </w:numPr>
-      </w:pPr>
-      <w:r>
-        <w:t xml:space="preserve">Parking Management </w:t>
-      </w:r>
-    </w:p>
-    <w:p>
-      <w:pPr>
-        <w:numPr>
-          <w:ilvl w:val="0"/>
-          <w:numId w:val="38"/>
-        </w:numPr>
-      </w:pPr>
-      <w:r>
-        <w:t xml:space="preserve">Multi-Society Support </w:t>
-      </w:r>
-    </w:p>
-    <w:p>
-      <w:pPr>
-        <w:numPr>
-          <w:ilvl w:val="0"/>
-          <w:numId w:val="38"/>
-        </w:numPr>
-      </w:pPr>
-      <w:r>
-        <w:t>Role-Based Access Control</w:t>
-      </w:r>
-    </w:p>
-    <w:p>
-      <w:pPr>
-        <w:rPr>
-          <w:b/>
-          <w:bCs/>
-        </w:rPr>
-      </w:pPr>
-    </w:p>
-    <w:p>
-      <w:pPr>
-        <w:rPr>
-          <w:b/>
-          <w:bCs/>
-        </w:rPr>
-      </w:pPr>
-      <w:r>
-        <w:rPr>
-          <w:b/>
-          <w:bCs/>
-        </w:rPr>
         <w:t>M</w:t>
       </w:r>
       <w:r>
@@ -4770,400 +4727,391 @@
         </w:numPr>
       </w:pPr>
       <w:r>
+        <w:t xml:space="preserve">Archive old notices. </w:t>
+      </w:r>
+    </w:p>
+    <w:p>
+      <w:pPr>
+        <w:rPr>
+          <w:b/>
+          <w:bCs/>
+        </w:rPr>
+      </w:pPr>
+      <w:r>
+        <w:rPr>
+          <w:b/>
+          <w:bCs/>
+        </w:rPr>
+        <w:t>Dashboard</w:t>
+      </w:r>
+    </w:p>
+    <w:p>
+      <w:pPr>
+        <w:numPr>
+          <w:ilvl w:val="0"/>
+          <w:numId w:val="44"/>
+        </w:numPr>
+      </w:pPr>
+      <w:r>
+        <w:t xml:space="preserve">Refresh dashboard automatically. </w:t>
+      </w:r>
+    </w:p>
+    <w:p>
+      <w:pPr>
+        <w:numPr>
+          <w:ilvl w:val="0"/>
+          <w:numId w:val="44"/>
+        </w:numPr>
+      </w:pPr>
+      <w:r>
+        <w:t xml:space="preserve">Display latest financial summary. </w:t>
+      </w:r>
+    </w:p>
+    <w:p>
+      <w:pPr>
+        <w:numPr>
+          <w:ilvl w:val="0"/>
+          <w:numId w:val="44"/>
+        </w:numPr>
+      </w:pPr>
+      <w:r>
+        <w:t xml:space="preserve">Display pending maintenance count. </w:t>
+      </w:r>
+    </w:p>
+    <w:p>
+      <w:pPr>
+        <w:rPr>
+          <w:b/>
+          <w:bCs/>
+        </w:rPr>
+      </w:pPr>
+    </w:p>
+    <w:p>
+      <w:pPr>
+        <w:rPr>
+          <w:b/>
+          <w:bCs/>
+        </w:rPr>
+      </w:pPr>
+    </w:p>
+    <w:p>
+      <w:pPr>
+        <w:rPr>
+          <w:b/>
+          <w:bCs/>
+        </w:rPr>
+      </w:pPr>
+      <w:r>
+        <w:rPr>
+          <w:b/>
+          <w:bCs/>
+        </w:rPr>
+        <w:t>AI Notice Generator</w:t>
+      </w:r>
+    </w:p>
+    <w:p>
+      <w:pPr>
+        <w:pStyle w:val="ListParagraph"/>
+        <w:numPr>
+          <w:ilvl w:val="0"/>
+          <w:numId w:val="57"/>
+        </w:numPr>
+      </w:pPr>
+      <w:r>
+        <w:t xml:space="preserve">Define what should happen if the AI fails to generate a notice. </w:t>
+      </w:r>
+    </w:p>
+    <w:p>
+      <w:pPr>
+        <w:pStyle w:val="ListParagraph"/>
+        <w:numPr>
+          <w:ilvl w:val="0"/>
+          <w:numId w:val="57"/>
+        </w:numPr>
+      </w:pPr>
+      <w:r>
+        <w:t>Specify the maximum prompt length and supported input format for AI-generated notices.</w:t>
+      </w:r>
+    </w:p>
+    <w:p/>
+    <w:p>
+      <w:pPr>
+        <w:rPr>
+          <w:b/>
+          <w:bCs/>
+        </w:rPr>
+      </w:pPr>
+      <w:r>
+        <w:rPr>
+          <w:b/>
+          <w:bCs/>
+        </w:rPr>
+        <w:t>2. Ambiguous Requirements</w:t>
+      </w:r>
+    </w:p>
+    <w:p>
+      <w:r>
+        <w:t>These requirements are unclear and should be clarified.</w:t>
+      </w:r>
+    </w:p>
+    <w:p>
+      <w:pPr>
+        <w:numPr>
+          <w:ilvl w:val="0"/>
+          <w:numId w:val="45"/>
+        </w:numPr>
+      </w:pPr>
+      <w:r>
+        <w:t xml:space="preserve">Who can add, edit, or delete residents? </w:t>
+      </w:r>
+    </w:p>
+    <w:p>
+      <w:pPr>
+        <w:numPr>
+          <w:ilvl w:val="0"/>
+          <w:numId w:val="45"/>
+        </w:numPr>
+      </w:pPr>
+      <w:r>
+        <w:t xml:space="preserve">Can multiple committee members use the system simultaneously? </w:t>
+      </w:r>
+    </w:p>
+    <w:p>
+      <w:pPr>
+        <w:numPr>
+          <w:ilvl w:val="0"/>
+          <w:numId w:val="45"/>
+        </w:numPr>
+      </w:pPr>
+      <w:r>
+        <w:t xml:space="preserve">Can one resident own multiple flats? </w:t>
+      </w:r>
+    </w:p>
+    <w:p>
+      <w:pPr>
+        <w:numPr>
+          <w:ilvl w:val="0"/>
+          <w:numId w:val="45"/>
+        </w:numPr>
+      </w:pPr>
+      <w:r>
+        <w:t xml:space="preserve">Can maintenance charges differ by flat type? </w:t>
+      </w:r>
+    </w:p>
+    <w:p>
+      <w:pPr>
+        <w:numPr>
+          <w:ilvl w:val="0"/>
+          <w:numId w:val="45"/>
+        </w:numPr>
+      </w:pPr>
+      <w:r>
+        <w:t xml:space="preserve">Can a resident pay maintenance in installments? </w:t>
+      </w:r>
+    </w:p>
+    <w:p>
+      <w:pPr>
+        <w:numPr>
+          <w:ilvl w:val="0"/>
+          <w:numId w:val="45"/>
+        </w:numPr>
+      </w:pPr>
+      <w:r>
+        <w:t xml:space="preserve">How is the current balance calculated? </w:t>
+      </w:r>
+    </w:p>
+    <w:p>
+      <w:pPr>
+        <w:numPr>
+          <w:ilvl w:val="0"/>
+          <w:numId w:val="45"/>
+        </w:numPr>
+      </w:pPr>
+      <w:r>
+        <w:t xml:space="preserve">Are deleted records permanently removed? </w:t>
+      </w:r>
+    </w:p>
+    <w:p>
+      <w:pPr>
+        <w:numPr>
+          <w:ilvl w:val="0"/>
+          <w:numId w:val="45"/>
+        </w:numPr>
+      </w:pPr>
+      <w:r>
+        <w:t xml:space="preserve">Can notices be edited after publishing? </w:t>
+      </w:r>
+    </w:p>
+    <w:p>
+      <w:pPr>
+        <w:numPr>
+          <w:ilvl w:val="0"/>
+          <w:numId w:val="45"/>
+        </w:numPr>
+      </w:pPr>
+      <w:r>
+        <w:t xml:space="preserve">How many financial years should be stored? </w:t>
+      </w:r>
+    </w:p>
+    <w:p>
+      <w:pPr>
+        <w:numPr>
+          <w:ilvl w:val="0"/>
+          <w:numId w:val="45"/>
+        </w:numPr>
+      </w:pPr>
+      <w:r>
+        <w:t xml:space="preserve">What happens if internet connectivity is lost while saving data? </w:t>
+      </w:r>
+    </w:p>
+    <w:p>
+      <w:pPr>
+        <w:numPr>
+          <w:ilvl w:val="0"/>
+          <w:numId w:val="45"/>
+        </w:numPr>
+      </w:pPr>
+      <w:r>
+        <w:t xml:space="preserve">Should AI-generated notices be saved automatically or only after user approval? </w:t>
+      </w:r>
+    </w:p>
+    <w:p>
+      <w:pPr>
+        <w:numPr>
+          <w:ilvl w:val="0"/>
+          <w:numId w:val="45"/>
+        </w:numPr>
+      </w:pPr>
+      <w:r>
+        <w:t>Can users edit the AI-generated notice before publishing?</w:t>
+      </w:r>
+    </w:p>
+    <w:p/>
+    <w:p>
+      <w:pPr>
+        <w:rPr>
+          <w:b/>
+          <w:bCs/>
+        </w:rPr>
+      </w:pPr>
+      <w:r>
+        <w:rPr>
+          <w:b/>
+          <w:bCs/>
+        </w:rPr>
+        <w:t>3. Edge Cases</w:t>
+      </w:r>
+    </w:p>
+    <w:p>
+      <w:r>
+        <w:t>These are unusual situations the system should handle correctly.</w:t>
+      </w:r>
+    </w:p>
+    <w:p>
+      <w:pPr>
+        <w:rPr>
+          <w:b/>
+          <w:bCs/>
+        </w:rPr>
+      </w:pPr>
+      <w:r>
+        <w:rPr>
+          <w:b/>
+          <w:bCs/>
+        </w:rPr>
+        <w:t>Authentication</w:t>
+      </w:r>
+    </w:p>
+    <w:p>
+      <w:pPr>
+        <w:numPr>
+          <w:ilvl w:val="0"/>
+          <w:numId w:val="46"/>
+        </w:numPr>
+      </w:pPr>
+      <w:r>
+        <w:t xml:space="preserve">Incorrect username or password. </w:t>
+      </w:r>
+    </w:p>
+    <w:p>
+      <w:pPr>
+        <w:numPr>
+          <w:ilvl w:val="0"/>
+          <w:numId w:val="46"/>
+        </w:numPr>
+      </w:pPr>
+      <w:r>
+        <w:t xml:space="preserve">Empty login fields. </w:t>
+      </w:r>
+    </w:p>
+    <w:p>
+      <w:pPr>
+        <w:numPr>
+          <w:ilvl w:val="0"/>
+          <w:numId w:val="46"/>
+        </w:numPr>
+      </w:pPr>
+      <w:r>
+        <w:t xml:space="preserve">Duplicate email during registration. </w:t>
+      </w:r>
+    </w:p>
+    <w:p>
+      <w:pPr>
+        <w:rPr>
+          <w:b/>
+          <w:bCs/>
+        </w:rPr>
+      </w:pPr>
+      <w:r>
+        <w:rPr>
+          <w:b/>
+          <w:bCs/>
+        </w:rPr>
+        <w:t>Resident Management</w:t>
+      </w:r>
+    </w:p>
+    <w:p>
+      <w:pPr>
+        <w:numPr>
+          <w:ilvl w:val="0"/>
+          <w:numId w:val="47"/>
+        </w:numPr>
+      </w:pPr>
+      <w:r>
+        <w:t xml:space="preserve">Duplicate flat number. </w:t>
+      </w:r>
+    </w:p>
+    <w:p>
+      <w:pPr>
+        <w:numPr>
+          <w:ilvl w:val="0"/>
+          <w:numId w:val="47"/>
+        </w:numPr>
+      </w:pPr>
+      <w:r>
+        <w:t xml:space="preserve">Duplicate phone number. </w:t>
+      </w:r>
+    </w:p>
+    <w:p>
+      <w:pPr>
+        <w:numPr>
+          <w:ilvl w:val="0"/>
+          <w:numId w:val="47"/>
+        </w:numPr>
+      </w:pPr>
+      <w:r>
+        <w:t xml:space="preserve">Empty resident name. </w:t>
+      </w:r>
+    </w:p>
+    <w:p>
+      <w:pPr>
+        <w:numPr>
+          <w:ilvl w:val="0"/>
+          <w:numId w:val="47"/>
+        </w:numPr>
+      </w:pPr>
+      <w:r>
         <w:lastRenderedPageBreak/>
-        <w:t xml:space="preserve">Archive old notices. </w:t>
-      </w:r>
-    </w:p>
-    <w:p>
-      <w:pPr>
-        <w:rPr>
-          <w:b/>
-          <w:bCs/>
-        </w:rPr>
-      </w:pPr>
-      <w:r>
-        <w:rPr>
-          <w:b/>
-          <w:bCs/>
-        </w:rPr>
-        <w:t>Dashboard</w:t>
-      </w:r>
-    </w:p>
-    <w:p>
-      <w:pPr>
-        <w:numPr>
-          <w:ilvl w:val="0"/>
-          <w:numId w:val="44"/>
-        </w:numPr>
-      </w:pPr>
-      <w:r>
-        <w:t xml:space="preserve">Refresh dashboard automatically. </w:t>
-      </w:r>
-    </w:p>
-    <w:p>
-      <w:pPr>
-        <w:numPr>
-          <w:ilvl w:val="0"/>
-          <w:numId w:val="44"/>
-        </w:numPr>
-      </w:pPr>
-      <w:r>
-        <w:t xml:space="preserve">Display latest financial summary. </w:t>
-      </w:r>
-    </w:p>
-    <w:p>
-      <w:pPr>
-        <w:numPr>
-          <w:ilvl w:val="0"/>
-          <w:numId w:val="44"/>
-        </w:numPr>
-      </w:pPr>
-      <w:r>
-        <w:t xml:space="preserve">Display pending maintenance count. </w:t>
-      </w:r>
-    </w:p>
-    <w:p>
-      <w:pPr>
-        <w:rPr>
-          <w:b/>
-          <w:bCs/>
-        </w:rPr>
-      </w:pPr>
-    </w:p>
-    <w:p>
-      <w:pPr>
-        <w:rPr>
-          <w:b/>
-          <w:bCs/>
-        </w:rPr>
-      </w:pPr>
-    </w:p>
-    <w:p>
-      <w:pPr>
-        <w:rPr>
-          <w:b/>
-          <w:bCs/>
-        </w:rPr>
-      </w:pPr>
-      <w:r>
-        <w:rPr>
-          <w:b/>
-          <w:bCs/>
-        </w:rPr>
-        <w:t>AI Notice Generator</w:t>
-      </w:r>
-    </w:p>
-    <w:p>
-      <w:pPr>
-        <w:pStyle w:val="ListParagraph"/>
-        <w:numPr>
-          <w:ilvl w:val="0"/>
-          <w:numId w:val="57"/>
-        </w:numPr>
-      </w:pPr>
-      <w:r>
-        <w:t xml:space="preserve">Define what should happen if the AI fails to generate a notice. </w:t>
-      </w:r>
-    </w:p>
-    <w:p>
-      <w:pPr>
-        <w:pStyle w:val="ListParagraph"/>
-        <w:numPr>
-          <w:ilvl w:val="0"/>
-          <w:numId w:val="57"/>
-        </w:numPr>
-      </w:pPr>
-      <w:r>
-        <w:t>Specify the maximum prompt length and supported input format for AI-generated notices.</w:t>
-      </w:r>
-    </w:p>
-    <w:p/>
-    <w:p>
-      <w:pPr>
-        <w:rPr>
-          <w:b/>
-          <w:bCs/>
-        </w:rPr>
-      </w:pPr>
-      <w:r>
-        <w:rPr>
-          <w:b/>
-          <w:bCs/>
-        </w:rPr>
-        <w:t>2. Ambiguous Requirements</w:t>
-      </w:r>
-    </w:p>
-    <w:p>
-      <w:r>
-        <w:t>These requirements are unclear and should be clarified.</w:t>
-      </w:r>
-    </w:p>
-    <w:p>
-      <w:pPr>
-        <w:numPr>
-          <w:ilvl w:val="0"/>
-          <w:numId w:val="45"/>
-        </w:numPr>
-      </w:pPr>
-      <w:r>
-        <w:t xml:space="preserve">Who can add, edit, or delete residents? </w:t>
-      </w:r>
-    </w:p>
-    <w:p>
-      <w:pPr>
-        <w:numPr>
-          <w:ilvl w:val="0"/>
-          <w:numId w:val="45"/>
-        </w:numPr>
-      </w:pPr>
-      <w:r>
-        <w:t xml:space="preserve">Can multiple committee members use the system simultaneously? </w:t>
-      </w:r>
-    </w:p>
-    <w:p>
-      <w:pPr>
-        <w:numPr>
-          <w:ilvl w:val="0"/>
-          <w:numId w:val="45"/>
-        </w:numPr>
-      </w:pPr>
-      <w:r>
-        <w:t xml:space="preserve">Can one resident own multiple flats? </w:t>
-      </w:r>
-    </w:p>
-    <w:p>
-      <w:pPr>
-        <w:numPr>
-          <w:ilvl w:val="0"/>
-          <w:numId w:val="45"/>
-        </w:numPr>
-      </w:pPr>
-      <w:r>
-        <w:t xml:space="preserve">Can maintenance charges differ by flat type? </w:t>
-      </w:r>
-    </w:p>
-    <w:p>
-      <w:pPr>
-        <w:numPr>
-          <w:ilvl w:val="0"/>
-          <w:numId w:val="45"/>
-        </w:numPr>
-      </w:pPr>
-      <w:r>
-        <w:t xml:space="preserve">Can a resident pay maintenance in </w:t>
-      </w:r>
-      <w:proofErr w:type="spellStart"/>
-      <w:r>
-        <w:t>installments</w:t>
-      </w:r>
-      <w:proofErr w:type="spellEnd"/>
-      <w:r>
-        <w:t xml:space="preserve">? </w:t>
-      </w:r>
-    </w:p>
-    <w:p>
-      <w:pPr>
-        <w:numPr>
-          <w:ilvl w:val="0"/>
-          <w:numId w:val="45"/>
-        </w:numPr>
-      </w:pPr>
-      <w:r>
-        <w:t xml:space="preserve">How is the current balance calculated? </w:t>
-      </w:r>
-    </w:p>
-    <w:p>
-      <w:pPr>
-        <w:numPr>
-          <w:ilvl w:val="0"/>
-          <w:numId w:val="45"/>
-        </w:numPr>
-      </w:pPr>
-      <w:r>
-        <w:t xml:space="preserve">Are deleted records permanently removed? </w:t>
-      </w:r>
-    </w:p>
-    <w:p>
-      <w:pPr>
-        <w:numPr>
-          <w:ilvl w:val="0"/>
-          <w:numId w:val="45"/>
-        </w:numPr>
-      </w:pPr>
-      <w:r>
-        <w:t xml:space="preserve">Can notices be edited after publishing? </w:t>
-      </w:r>
-    </w:p>
-    <w:p>
-      <w:pPr>
-        <w:numPr>
-          <w:ilvl w:val="0"/>
-          <w:numId w:val="45"/>
-        </w:numPr>
-      </w:pPr>
-      <w:r>
-        <w:t xml:space="preserve">How many financial years should be stored? </w:t>
-      </w:r>
-    </w:p>
-    <w:p>
-      <w:pPr>
-        <w:numPr>
-          <w:ilvl w:val="0"/>
-          <w:numId w:val="45"/>
-        </w:numPr>
-      </w:pPr>
-      <w:r>
-        <w:t xml:space="preserve">What happens if internet connectivity is lost while saving data? </w:t>
-      </w:r>
-    </w:p>
-    <w:p>
-      <w:pPr>
-        <w:numPr>
-          <w:ilvl w:val="0"/>
-          <w:numId w:val="45"/>
-        </w:numPr>
-      </w:pPr>
-      <w:r>
-        <w:t xml:space="preserve">Should AI-generated notices be saved automatically or only after user approval? </w:t>
-      </w:r>
-    </w:p>
-    <w:p>
-      <w:pPr>
-        <w:numPr>
-          <w:ilvl w:val="0"/>
-          <w:numId w:val="45"/>
-        </w:numPr>
-      </w:pPr>
-      <w:r>
-        <w:t>Can users edit the AI-generated notice before publishing?</w:t>
-      </w:r>
-    </w:p>
-    <w:p/>
-    <w:p>
-      <w:pPr>
-        <w:rPr>
-          <w:b/>
-          <w:bCs/>
-        </w:rPr>
-      </w:pPr>
-      <w:r>
-        <w:rPr>
-          <w:b/>
-          <w:bCs/>
-        </w:rPr>
-        <w:t>3. Edge Cases</w:t>
-      </w:r>
-    </w:p>
-    <w:p>
-      <w:r>
-        <w:t>These are unusual situations the system should handle correctly.</w:t>
-      </w:r>
-    </w:p>
-    <w:p>
-      <w:pPr>
-        <w:rPr>
-          <w:b/>
-          <w:bCs/>
-        </w:rPr>
-      </w:pPr>
-      <w:r>
-        <w:rPr>
-          <w:b/>
-          <w:bCs/>
-        </w:rPr>
-        <w:t>Authentication</w:t>
-      </w:r>
-    </w:p>
-    <w:p>
-      <w:pPr>
-        <w:numPr>
-          <w:ilvl w:val="0"/>
-          <w:numId w:val="46"/>
-        </w:numPr>
-      </w:pPr>
-      <w:r>
-        <w:t xml:space="preserve">Incorrect username or password. </w:t>
-      </w:r>
-    </w:p>
-    <w:p>
-      <w:pPr>
-        <w:numPr>
-          <w:ilvl w:val="0"/>
-          <w:numId w:val="46"/>
-        </w:numPr>
-      </w:pPr>
-      <w:r>
-        <w:t xml:space="preserve">Empty login fields. </w:t>
-      </w:r>
-    </w:p>
-    <w:p>
-      <w:pPr>
-        <w:numPr>
-          <w:ilvl w:val="0"/>
-          <w:numId w:val="46"/>
-        </w:numPr>
-      </w:pPr>
-      <w:r>
-        <w:lastRenderedPageBreak/>
-        <w:t xml:space="preserve">Duplicate email during registration. </w:t>
-      </w:r>
-    </w:p>
-    <w:p>
-      <w:pPr>
-        <w:rPr>
-          <w:b/>
-          <w:bCs/>
-        </w:rPr>
-      </w:pPr>
-      <w:r>
-        <w:rPr>
-          <w:b/>
-          <w:bCs/>
-        </w:rPr>
-        <w:t>Resident Management</w:t>
-      </w:r>
-    </w:p>
-    <w:p>
-      <w:pPr>
-        <w:numPr>
-          <w:ilvl w:val="0"/>
-          <w:numId w:val="47"/>
-        </w:numPr>
-      </w:pPr>
-      <w:r>
-        <w:t xml:space="preserve">Duplicate flat number. </w:t>
-      </w:r>
-    </w:p>
-    <w:p>
-      <w:pPr>
-        <w:numPr>
-          <w:ilvl w:val="0"/>
-          <w:numId w:val="47"/>
-        </w:numPr>
-      </w:pPr>
-      <w:r>
-        <w:t xml:space="preserve">Duplicate phone number. </w:t>
-      </w:r>
-    </w:p>
-    <w:p>
-      <w:pPr>
-        <w:numPr>
-          <w:ilvl w:val="0"/>
-          <w:numId w:val="47"/>
-        </w:numPr>
-      </w:pPr>
-      <w:r>
-        <w:t xml:space="preserve">Empty resident name. </w:t>
-      </w:r>
-    </w:p>
-    <w:p>
-      <w:pPr>
-        <w:numPr>
-          <w:ilvl w:val="0"/>
-          <w:numId w:val="47"/>
-        </w:numPr>
-      </w:pPr>
-      <w:r>
         <w:t xml:space="preserve">Searching for a resident who does not exist. </w:t>
       </w:r>
     </w:p>
@@ -5487,92 +5435,42 @@
         </w:numPr>
       </w:pPr>
       <w:r>
+        <w:t xml:space="preserve">Anthropic API does not return a response due to a network or service issue. </w:t>
+      </w:r>
+    </w:p>
+    <w:p>
+      <w:pPr>
+        <w:numPr>
+          <w:ilvl w:val="0"/>
+          <w:numId w:val="51"/>
+        </w:numPr>
+      </w:pPr>
+      <w:r>
+        <w:t xml:space="preserve"> AI generates incomplete or irrelevant content, requiring manual editing.</w:t>
+      </w:r>
+    </w:p>
+    <w:p>
+      <w:pPr>
+        <w:rPr>
+          <w:b/>
+          <w:bCs/>
+        </w:rPr>
+      </w:pPr>
+      <w:r>
+        <w:rPr>
+          <w:b/>
+          <w:bCs/>
+        </w:rPr>
+        <w:t>Conclusion</w:t>
+      </w:r>
+    </w:p>
+    <w:p>
+      <w:r>
+        <w:t xml:space="preserve">Smart Society ERP is designed to simplify the management of housing societies by replacing manual processes with a centralized digital platform. The MVP focuses on core features such as resident management, maintenance tracking, accounting, notice management, an AI-powered Notice </w:t>
+      </w:r>
+      <w:r>
         <w:lastRenderedPageBreak/>
-        <w:t xml:space="preserve">Anthropic API does not return a response due to a network or service issue. </w:t>
-      </w:r>
-    </w:p>
-    <w:p>
-      <w:pPr>
-        <w:numPr>
-          <w:ilvl w:val="0"/>
-          <w:numId w:val="51"/>
-        </w:numPr>
-      </w:pPr>
-      <w:r>
-        <w:t xml:space="preserve"> AI generates incomplete or irrelevant content, requiring manual editing.</w:t>
-      </w:r>
-    </w:p>
-    <w:p>
-      <w:pPr>
-        <w:ind w:left="360"/>
-      </w:pPr>
-    </w:p>
-    <w:p>
-      <w:pPr>
-        <w:rPr>
-          <w:b/>
-          <w:bCs/>
-        </w:rPr>
-      </w:pPr>
-    </w:p>
-    <w:p>
-      <w:pPr>
-        <w:rPr>
-          <w:b/>
-          <w:bCs/>
-        </w:rPr>
-      </w:pPr>
-    </w:p>
-    <w:p>
-      <w:pPr>
-        <w:rPr>
-          <w:b/>
-          <w:bCs/>
-        </w:rPr>
-      </w:pPr>
-    </w:p>
-    <w:p>
-      <w:pPr>
-        <w:rPr>
-          <w:b/>
-          <w:bCs/>
-        </w:rPr>
-      </w:pPr>
-    </w:p>
-    <w:p>
-      <w:pPr>
-        <w:rPr>
-          <w:b/>
-          <w:bCs/>
-        </w:rPr>
-      </w:pPr>
-    </w:p>
-    <w:p>
-      <w:pPr>
-        <w:rPr>
-          <w:b/>
-          <w:bCs/>
-        </w:rPr>
-      </w:pPr>
-    </w:p>
-    <w:p>
-      <w:pPr>
-        <w:rPr>
-          <w:b/>
-          <w:bCs/>
-        </w:rPr>
-      </w:pPr>
-      <w:r>
-        <w:rPr>
-          <w:b/>
-          <w:bCs/>
-        </w:rPr>
-        <w:t>Conclusion</w:t>
-      </w:r>
-    </w:p>
-    <w:p>
-      <w:r>
-        <w:t>Smart Society ERP is designed to simplify the management of housing societies by replacing manual processes with a centralized digital platform. The MVP focuses on core features such as resident management, maintenance tracking, accounting, notice management, an AI-powered Notice Generator, and a dashboard to improve efficiency, organization, and communication. In the future, the system can be enhanced with additional features such as complaint management, visitor management, AI financial insights and reports, and a resident portal to provide a more comprehensive society management solution.</w:t>
+        <w:t>Generator, and a dashboard to improve efficiency, organization, and communication. In the future, the system can be enhanced with additional features such as complaint management, visitor management, AI financial insights and reports, and a resident portal to provide a more comprehensive society management solution.</w:t>
       </w:r>
     </w:p>
     <w:p/>

</xml_diff>